<commit_message>
Publish Claude English volume draft: 87 of 873 PDF pages
</commit_message>
<xml_diff>
--- a/research/magyar-zsido-okleveltar-vii-volume-en.docx
+++ b/research/magyar-zsido-okleveltar-vii-volume-en.docx
@@ -12,7 +12,7 @@
     </w:p>
     <w:p>
       <w:r>
-        <w:t>56 of 873 PDF pages translated. Status: running.</w:t>
+        <w:t>87 of 873 PDF pages translated. Status: stopped.</w:t>
       </w:r>
     </w:p>
     <w:p>
@@ -2398,6 +2398,1890 @@
       <w:r>
         <w:br/>
         <w:t xml:space="preserve"> 54</w:t>
+      </w:r>
+    </w:p>
+    <w:p>
+      <w:pPr>
+        <w:pStyle w:val="Heading1"/>
+      </w:pPr>
+      <w:r>
+        <w:t>PDF viewer page 57</w:t>
+      </w:r>
+    </w:p>
+    <w:p>
+      <w:r>
+        <w:t>https://real-eod.mtak.hu/2973/1/Magyar_zsido_okleveltar_VII.pdf#page=57</w:t>
+      </w:r>
+    </w:p>
+    <w:p>
+      <w:r>
+        <w:t>returns had been completed everywhere by the end of either February or May 1727, and had been sent in from everywhere to the Lieutenancy Council. The Lieutenancy Council entrusted one of its councillors, János Antolchich, with reviewing the reports received in the matter of the Jewish census and informing the Council about them.</w:t>
+        <w:br/>
+        <w:t xml:space="preserve">      János Antolchich did very thorough work. He showed which of the counties, towns and districts had reported that they had no Jews, which had not answered the Lieutenancy Council's call, and which had sent returns that could not be considered adequate. He also explained in detail why these latter returns were inadequate. He submitted his statement to the Lieutenancy Council on 30 May 1727.15</w:t>
+        <w:br/>
+        <w:t xml:space="preserve">      On the basis of János Antolchich's report the Lieutenancy Council drew up the statement which it submitted to the monarch on 19 July 1727.16 This statement grouped the counties, towns and districts into four categories.</w:t>
+        <w:br/>
+        <w:t xml:space="preserve">      In the first category it placed those that had reported that they had no Jewish inhabitants. This category consisted primarily of towns, namely the following: Bakabánya, Bazin, Bártfa, Besztercebánya, Bélabánya, Debrecen, Eperjes, Esztergom, Kassa, Késmárk, Kismarton, Korpona, Körmöcbánya, Libetbánya, Nagybánya, Nagyszombat, Pest, Ruszt, Selmecbánya, Sopron, Szeben, Szeged and Zólyom.17 – Of the counties, Bars and Csongrád, as well as Kraszna from the Partium. – Likewise from the Partium, Kővár district.</w:t>
+        <w:br/>
+        <w:t xml:space="preserve">      In the second category the Lieutenancy Council placed those counties and towns that had prepared and sent adequate returns. A return qualified as adequate if it showed the place of residence and number of the Jews enumerated, and also whether they paid public tax and seigneurial dues. This category comprised the counties of Árva, Bihar, Hont, Sopron, Vasvár and Zemplén, and the towns of Buda, Kőszeg, Modor, Szakolca, Szatmárnémeti and Trencsén.</w:t>
+        <w:br/>
+        <w:t xml:space="preserve">      The returns prepared by the counties and towns placed in the third category did not meet the said requirements. This category comprised the counties of Baranya, Bács, Békés, Borsod, Fejér, Győr, Heves, Liptó, Moson, Nógrád, Pest, Somogy, Trencsén, Turóc and Ung. There was no town in this category.</w:t>
+        <w:br/>
+        <w:t xml:space="preserve">      The fourth category comprised those counties and towns that did not even answer the Lieutenancy Council's repeated calls. These were: the counties of Abaújvár, Arad, Bereg, Bodrog, Csanád, Esztergom, Gömör, Komárom, Máramaros, Nyitra, Pozsony, Sáros, Szabolcs, Szatmár, Szepes, Tolna, Torna, Ugocsa, Veszprém, Zala and Zólyom, and the towns of Breznóbánya, Lőcse, Pozsony, Szentgyörgy, Székesfehérvár and Újbánya in Hungary proper,18 as well as Közép Szolnok county in the Partium.19</w:t>
+      </w:r>
+    </w:p>
+    <w:p>
+      <w:r>
+        <w:t xml:space="preserve">      15 Original fair copy of János Antolchich's report: O. L. Helyt. lvt. Jud. Lad. B. Fasc. 7. No 1. 1727. No 2. The appendix to the report is the detailed statement.</w:t>
+        <w:br/>
+        <w:t xml:space="preserve">      16 The statement was prepared on 23 June 1727 in the accounting office of the Lieutenancy Council. – Original fair copy of the Lieutenancy Council's submission: O. L. M. kanc. lvt. Acta part. No 269. Published in: M.-Zs. Okl. III. k. Bp., 1937. pp. 509–510. – Original draft of the submission: O. L. Helyt. lvt. Jud. Lad. B. Fasc. 7. No 1. 1727. No 3.</w:t>
+        <w:br/>
+        <w:t xml:space="preserve">      17 The market town of Felsőbánya also figured in this category. – Győr and Komárom were not yet free royal towns at that time.</w:t>
+        <w:br/>
+        <w:t xml:space="preserve">      18 To this category also belonged the Jász-Kun district and the Hajdú towns, which do not appear in the statement.</w:t>
+        <w:br/>
+        <w:t xml:space="preserve">      19 To this category also belonged Zaránd county in the Partium, which does not appear in the statement.</w:t>
+      </w:r>
+    </w:p>
+    <w:p>
+      <w:r>
+        <w:t xml:space="preserve">                                                                                               55</w:t>
+      </w:r>
+    </w:p>
+    <w:p>
+      <w:pPr>
+        <w:pStyle w:val="Heading1"/>
+      </w:pPr>
+      <w:r>
+        <w:t>PDF viewer page 58</w:t>
+      </w:r>
+    </w:p>
+    <w:p>
+      <w:r>
+        <w:t>https://real-eod.mtak.hu/2973/1/Magyar_zsido_okleveltar_VII.pdf#page=58</w:t>
+      </w:r>
+    </w:p>
+    <w:p>
+      <w:r>
+        <w:t xml:space="preserve">      Thus, two years after it had been ordered, the result of the census was far from satisfactory. 22 counties and 6 towns had not even deigned to reply to the Lieutenancy Council. 15 counties had prepared inadequate returns. Only 6 counties and 6 towns had sent in returns that met the requirements.</w:t>
+        <w:br/>
+        <w:t xml:space="preserve">      The Lieutenancy Council sent up all the returns received up to then to the court in Vienna, to the monarch, or rather to the Hungarian Chancellery.</w:t>
+        <w:br/>
+        <w:t xml:space="preserve">      At the same time, i.e. on 19 July 1727 [OCR: 'ID'; read as 19], it again issued an order to those counties and towns which the said statement had placed in the third and fourth categories, namely those which had either sent in no return at all or had prepared an inadequate one. In this order it called upon these counties and towns to enumerate the Jews living in their territory without delay. It now prescribed much more precisely what the return should be like and what it should contain. It should list every Jewish male by name, not only the heads of household but also their sons, relatives, dependants and servants. It should list the name of the locality where those enumerated lived. It should state whether they had land, and if so, what kind, and whether they cultivated it themselves or had it cultivated by others. It should state what they paid, and under what title, to the state, the county or town, and to their landlord on account of their land or their trade.20</w:t>
+        <w:br/>
+        <w:t xml:space="preserve">      The monarch, or rather the Hungarian Chancellery, replied on 16 October 1727 [OCR: 'l ö'; read as 16] to the Lieutenancy Council's submission dated 19 July of that year. In the meantime, however, it had also urged the census in its order of 25 September 1727. In this rescript it pointed out that restrictive measures against the Jews were being prepared in Bohemia, so it was to be feared that they would come from there to Hungary. To prevent this, their enumeration was urgent.21</w:t>
+        <w:br/>
+        <w:t xml:space="preserve">      The royal order of 16 October 1727 expressed astonishment that the return had not been completed even by such a county as Pozsony, in whose territory the seat of the Lieutenancy Council was located. It again urged the submission of the returns.22</w:t>
+        <w:br/>
+        <w:t xml:space="preserve">      On 1? November 1727 [OCR: 'l d'; day uncertain] the Lieutenancy Council sent a further report to the monarch in the matter of the Jewish census. It submitted the returns that had come in in the meantime. Returns came in from the following counties: Abaújvár, Árva, Baranya, Bereg, Heves, Komárom, Liptó, Moson, Nógrád, Pest, Sáros and Turóc in Hungary proper, and Közép Szolnok in the Partium. Of these, Árva, Baranya, Heves,</w:t>
+      </w:r>
+    </w:p>
+    <w:p>
+      <w:r>
+        <w:t xml:space="preserve">      20 The relevant part of the Lieutenancy Council's order read [Latin, OCR heavily garbled; translated]: "We therefore seriously and out of abundant benevolence notify Your aforementioned Lordships herewith that they shall submit to this Royal Lieutenancy Council without delay a genuine and circumstantial conscription and information, specific not only of the Jewish lodgers or heads of household inhabiting [the county], but also of their sons, relatives and kinsmen, as well as servants, with expression of the name, of all persons of the male sex whatsoever found within the bosom of that county and fixing their dwellings there; and also of who lives in which place; whether they hold lands and of what kind, and whether they cultivate them themselves or through others; and what, from these or from their trade, they contribute to the public, or for domestic needs, or even to the landlords themselves, and under what title they pay what – and that they omit nothing whatsoever." – Original draft of the two Lieutenancy Council orders: O. L. Helyt. lvt. Jud. Lad. B. Fasc. 7. No 1. 1721 [sic in OCR; possibly 1727]. No 4–6.</w:t>
+        <w:br/>
+        <w:t xml:space="preserve">      21 Original draft of the royal order: O. L. M. kanc. lvt. Acta part. No 269. – Published in: M.-Zs. Okl. III. k. Bp., 1937. p. 623 [OCR reading].</w:t>
+        <w:br/>
+        <w:t xml:space="preserve">      22 Original fair copy of the royal order: O. L. M. kanc. lvt. Acta part. No 269. – Published in: M.-Zs. Okl. III. k. Bp., 1937. pp. 524–525. – Contemporary official copy of the order: O. L. Helyt. lvt. Jud. Idealia. No 1. 1727. okt. 16. – The order also deals with Jewish customs collectors; however, since this question is not connected with the matter of the census, I do not discuss it.</w:t>
+      </w:r>
+    </w:p>
+    <w:p>
+      <w:r>
+        <w:t>56</w:t>
+      </w:r>
+    </w:p>
+    <w:p>
+      <w:pPr>
+        <w:pStyle w:val="Heading1"/>
+      </w:pPr>
+      <w:r>
+        <w:t>PDF viewer page 59</w:t>
+      </w:r>
+    </w:p>
+    <w:p>
+      <w:r>
+        <w:t>https://real-eod.mtak.hu/2973/1/Magyar_zsido_okleveltar_VII.pdf#page=59</w:t>
+      </w:r>
+    </w:p>
+    <w:p>
+      <w:r>
+        <w:t>Liptó, Nógrád, Pest and Turóc counties sent in their second return, Abaújvár, Bereg, Komárom, Sáros and Közép Szolnok their first, and Moson its third. – Gömör and Zólyom, as well as – contrary to its earlier report – Hont counties reported that no Jews lived in their territory.23</w:t>
+        <w:br/>
+        <w:t xml:space="preserve">      At the end of 1727 and in the first months of 1728 further returns reached the Lieutenancy Council. It submitted these on 10 March 1728. They were the returns of Arad, Bács, Máramaros, Pozsony, Szepes, Tolna, Torna, Trencsén, Ugocsa, Ung and Zaránd counties, the last from the Partium, the other 10 from Hungary proper. Of these, Arad, Máramaros, Pozsony, Szepes, Tolna, Torna, Ugocsa and Zaránd sent a return for the first time, and Bács, Trencsén and Ung for the second time.24</w:t>
+        <w:br/>
+        <w:t xml:space="preserve">      We do not know of any further submissions by the Lieutenancy Council in the matter of the Jewish census ordered in 1725. Apart from the returns mentioned in these submissions, a few more came in. Of the counties, Nyitra and Zala, and of the towns, Szentgyörgy also sent returns to the Lieutenancy Council.</w:t>
+        <w:br/>
+        <w:t xml:space="preserve">      But even so, despite the provisions of the monarch and the Lieutenancy Council repeated so many times, there remained counties, towns and districts that sent neither a return nor a report stating that they had no Jewish inhabitants. Among the counties these were Csanád, Esztergom, Szabolcs, Szatmár and Veszprém; among the towns Breznóbánya, Lőcse, Pozsony, Székesfehérvár and Újbánya; and among the districts the Jász-Kun district and the Hajdú towns.</w:t>
+        <w:br/>
+        <w:t xml:space="preserve">      If we look at where Jews were enumerated in the 1730s [OCR: 'InO-as'; read as 1730s] and the 1740s, then on this basis we may assume almost with certainty only of the 5 towns and 2 districts in question that they had no Jewish inhabitants.25 Of the 5 counties in question we can venture this assumption only for Csanád. Csanád county sent a negative report to the Lieutenancy Council in 1736 [OCR: 'InG'; read as 1736], but in the 1740s it already submitted returns. In 1748 [OCR: '174S'] Csanád county had 12, Esztergom 1?6 [OCR: '] :i6'; digits uncertain], Szabolcs 22? [OCR: '22]'; last digit uncertain], Szatmár 346, and Veszprém 327 Jewish inhabitants.26 Thus in the 1720s, of the five counties in question, it is probable only in the case of Csanád that it did not enumerate the Jews living in its territory not out of negligence but because there were none. The other four counties in all probability did not carry out the orders of the monarch and the Lieutenancy Council.</w:t>
+        <w:br/>
+        <w:t xml:space="preserve">      We have no knowledge of their having received any punishment for failing to carry out the census.</w:t>
+        <w:br/>
+        <w:t xml:space="preserve">      The Hungarian Chancellery had the returns it received copied, placed the copies among its own records, and sent the originals27 back to the Lieutenancy Council; these entered the Lieutenancy Council's records.</w:t>
+      </w:r>
+    </w:p>
+    <w:p>
+      <w:r>
+        <w:t xml:space="preserve">      23 Original draft of the Lieutenancy Council's submission: O. L. Helyt. lvt. Jud. Lad. B. Fasc. 7. No 1. 1727. No 6 [OCR: 'ti'].</w:t>
+        <w:br/>
+        <w:t xml:space="preserve">      24 Original draft of the Lieutenancy Council's submission: Ibid. 1728. No 1.</w:t>
+        <w:br/>
+        <w:t xml:space="preserve">      25 According to the statement of 25 July 1748, the most reliable in this respect, which will be discussed below, no Jews lived in the five towns and the two districts.</w:t>
+        <w:br/>
+        <w:t xml:space="preserve">      26 According to the statement mentioned in the previous note.</w:t>
+        <w:br/>
+        <w:t xml:space="preserve">      27 These "originals" were sometimes already copies made by the counties or towns; in such cases the counties or towns kept the original copies and placed them among their own records. Considering the relative completeness of the Lieutenancy Council copies, we considered it unnecessary to search for these county and town copies.</w:t>
+      </w:r>
+    </w:p>
+    <w:p>
+      <w:r>
+        <w:t xml:space="preserve">                                                                                            57</w:t>
+      </w:r>
+    </w:p>
+    <w:p>
+      <w:pPr>
+        <w:pStyle w:val="Heading1"/>
+      </w:pPr>
+      <w:r>
+        <w:t>PDF viewer page 60</w:t>
+      </w:r>
+    </w:p>
+    <w:p>
+      <w:r>
+        <w:t>https://real-eod.mtak.hu/2973/1/Magyar_zsido_okleveltar_VII.pdf#page=60</w:t>
+      </w:r>
+    </w:p>
+    <w:p>
+      <w:r>
+        <w:t xml:space="preserve">      The returns are now among the records of the Hungarian Chancellery and of the Lieutenancy Council, in the custody of the Hungarian National Archives.28</w:t>
+        <w:br/>
+        <w:t xml:space="preserve">      Altogether the Jewish returns of 36 [OCR: '3H'; cf. p. 60 '36'] counties and 7 towns from the period 1725–1728 survive here. Two of them (that of Győr county and that of the town of Buda) survive only in Chancellery copies; the rest survive in the "original" copies received by the Lieutenancy Council and for the most part also in Chancellery copies.</w:t>
+        <w:br/>
+        <w:t xml:space="preserve">      The history of the census has revealed the explanation of why some counties prepared the return twice, and Moson even three times.</w:t>
+        <w:br/>
+        <w:t xml:space="preserve">      The history of the census also provides an explanation of why the returns prepared in the various counties and towns are not uniform. We have seen that the Lieutenancy Council's circular of 9 July 1725 defined only approximately what the return should contain, and only on 29 July 1727 did it prescribe the requirements more precisely. But even so it could not ensure that the enumerators commissioned by the counties and towns proceeded uniformly everywhere.</w:t>
+        <w:br/>
+        <w:t xml:space="preserve">      The completed returns thus illuminate the situation of Hungarian Jewry in the period 1725–1728 in varying detail.29</w:t>
+        <w:br/>
+        <w:t xml:space="preserve">      The analysis of the content and form of the returns and the establishment of the lessons arising from them is not the task of this study.</w:t>
+      </w:r>
+    </w:p>
+    <w:p>
+      <w:r>
+        <w:t xml:space="preserve">                                                 *</w:t>
+        <w:br/>
+        <w:t xml:space="preserve">      There is no trace of any measure having been put into effect against Hungarian Jewry on the basis of the national census carried out in the second half of the 1720s. The planned measures to prevent the immigration of Jews and to limit their number did not materialize.</w:t>
+        <w:br/>
+        <w:t xml:space="preserve">      The number of Jews thus grew unhindered, and this growth was evidently not merely the consequence of natural increase, but also resulted from immigration from beyond the borders. The Viennese Court Chamber drew the monarch's attention to this growth in 1785 [sic in OCR; context suggests 1735]. It referred to the excessively increased number of the Jews of Máramaros on the basis of a return which was presumably prepared for Chamber purposes.</w:t>
+        <w:br/>
+        <w:t xml:space="preserve">      By his order dated 9 September 1735 the monarch sent this return to the Lieutenancy Council. The royal order considered it beyond doubt that the number of Jews had risen in a similar manner not only in Máramaros but in other parts of the country as well, as a result of restrictive measures having been introduced in the neighbouring hereditary provinces. It laid down that in Hungary, too, only as many Jews might be tolerated as did not harm the public and did not cause the ruin of the country's other inhabitants. It called upon the Lieutenancy Council to have the Jews enumerated in the other counties and towns of the country as well, and on the basis of the result of the census to make a proposal for reducing the number of Jews, or rather for preventing their further growth, as it had done in its submission dated 8? [OCR: 'R'] January 1727.</w:t>
+      </w:r>
+    </w:p>
+    <w:p>
+      <w:r>
+        <w:t xml:space="preserve">      28 Location of the Chancellery copies: O. L. M. kanc. lvt. Acta part. No 269. – The Lieutenancy Council copies are at present still in two places: O. L. Helyt. lvt. Jud. No 1. and O. L. Helyt. lvt. Fasc. mens. Litt., under various daily dates. Those in the latter place will be transferred to the former.</w:t>
+        <w:br/>
+        <w:t xml:space="preserve">      29 Volume III of M.-Zs. Okl. (Bp., 1937) published the returns of Buda (pp. 468–471), from the return of Pest county that of Óbuda (pp. 515–518), and from the return of Pozsony county those of the Jews living in the vicinity of the town of Pozsony (pp. 533?–556? [OCR: '53:l-55(i']).</w:t>
+      </w:r>
+    </w:p>
+    <w:p>
+      <w:r>
+        <w:t>58</w:t>
+      </w:r>
+    </w:p>
+    <w:p>
+      <w:pPr>
+        <w:pStyle w:val="Heading1"/>
+      </w:pPr>
+      <w:r>
+        <w:t>PDF viewer page 61</w:t>
+      </w:r>
+    </w:p>
+    <w:p>
+      <w:r>
+        <w:t>https://real-eod.mtak.hu/2973/1/Magyar_zsido_okleveltar_VII.pdf#page=61</w:t>
+      </w:r>
+    </w:p>
+    <w:p>
+      <w:r>
+        <w:t>Let it meanwhile order that the landlords should not admit wandering Jews to their estates.30</w:t>
+        <w:br/>
+        <w:t xml:space="preserve">      This royal rescript ordered the second national census of Hungarian Jewry in the first half of the 18th century. The aim of the census ordered in 1735 was the same as that of the one held ten years earlier: establishing the number of Jews with a view to reducing it, or rather preventing its further growth. Thus this, too, was primarily a census with a public-order purpose.</w:t>
+        <w:br/>
+        <w:t xml:space="preserve">      This census, however – like the one ordered in 1725 – also had an economic purpose. The monarch wished to learn not only where and how many Jews lived in the country, but also under what material circumstances, and not least under whose seigneurial protection they lived and what they paid in return for this protection. On the other hand, he did not wish for information on whether they shared in public burdens, or whether they paid state, county or town taxes.</w:t>
+        <w:br/>
+        <w:t xml:space="preserve">      Although the royal order did not say what the return should contain, the columns of the Máramaros county Chamber return enclosed as a model indicated what the Viennese court wanted to know.31</w:t>
+        <w:br/>
+        <w:t xml:space="preserve">      The Lieutenancy Council took this Chamber return as its basis when it drew up the questions of the census. It did, however, somewhat expand these points. It likewise set out the questions in a tabular header, though not in German but in Latin. The questions, i.e. the columns of the tabular return, were the following:</w:t>
+        <w:br/>
+        <w:t xml:space="preserve">      name of the locality,</w:t>
+        <w:br/>
+        <w:t xml:space="preserve">      names of the Jewish heads of household,</w:t>
+        <w:br/>
+        <w:t xml:space="preserve">      number of wives,</w:t>
+        <w:br/>
+        <w:t xml:space="preserve">      number of older children,</w:t>
+        <w:br/>
+        <w:t xml:space="preserve">      number of younger children,</w:t>
+        <w:br/>
+        <w:t xml:space="preserve">      number of teachers,</w:t>
+        <w:br/>
+        <w:t xml:space="preserve">      number of male servants,</w:t>
+        <w:br/>
+        <w:t xml:space="preserve">      number of female servants,</w:t>
+        <w:br/>
+        <w:t xml:space="preserve">      number of persons belonging to the household,</w:t>
+        <w:br/>
+        <w:t xml:space="preserve">      number of horses,</w:t>
+        <w:br/>
+        <w:t xml:space="preserve">      number of oxen,</w:t>
+        <w:br/>
+        <w:t xml:space="preserve">      number of cows,</w:t>
+        <w:br/>
+        <w:t xml:space="preserve">      number of calves,</w:t>
+        <w:br/>
+        <w:t xml:space="preserve">      name and residence of the hereditary landlord,</w:t>
+        <w:br/>
+        <w:t xml:space="preserve">      name of the present landlord,</w:t>
+        <w:br/>
+        <w:t xml:space="preserve">      annual sum paid in cash to the hereditary landlord,</w:t>
+        <w:br/>
+        <w:t xml:space="preserve">      type of produce paid to the hereditary landlord,</w:t>
+      </w:r>
+    </w:p>
+    <w:p>
+      <w:r>
+        <w:t xml:space="preserve">      30 Original draft of the royal order: O. L. M. kanc. lvt., Conc. exp. 1735 [OCR: '1'3,J'] Sept. No 26. – Published in: M.-Zs. Okl. III. k. Bp., 1937. pp. 693–694 [OCR: '6U3-(l\}4'; page numbers uncertain]. – Contemporary official copy of the order: O. L. Helyt. lvt. Jud. Idealia. No 1. 1735. szept. 9 [OCR: 'U.']. Here lies the Máramaros Jewish return, undated.</w:t>
+        <w:br/>
+        <w:t xml:space="preserve">      31 The columns of this return, prepared in German, were the following: name of the locality, names of the Jewish heads of household, number of wives, number of older children, number of younger children, number of male servants, number of female servants, total number of persons belonging to the household, number of horses, number of oxen, number of cows, number of calves, amount of annual rent paid to the landlord, and finally the name of the landlord.</w:t>
+      </w:r>
+    </w:p>
+    <w:p>
+      <w:r>
+        <w:t xml:space="preserve">                                                                                                 59</w:t>
+      </w:r>
+    </w:p>
+    <w:p>
+      <w:pPr>
+        <w:pStyle w:val="Heading1"/>
+      </w:pPr>
+      <w:r>
+        <w:t>PDF viewer page 62</w:t>
+      </w:r>
+    </w:p>
+    <w:p>
+      <w:r>
+        <w:t>https://real-eod.mtak.hu/2973/1/Magyar_zsido_okleveltar_VII.pdf#page=62</w:t>
+      </w:r>
+    </w:p>
+    <w:p>
+      <w:r>
+        <w:t xml:space="preserve">     annual amount of produce paid to the hereditary landlord,</w:t>
+        <w:br/>
+        <w:t xml:space="preserve">     annual sum paid in cash to the present landlord,</w:t>
+        <w:br/>
+        <w:t xml:space="preserve">     type of produce paid to the present landlord,</w:t>
+        <w:br/>
+        <w:t xml:space="preserve">     annual amount of produce paid to the present landlord,</w:t>
+        <w:br/>
+        <w:t xml:space="preserve">     occupation of the Jewish heads of household.32</w:t>
+      </w:r>
+    </w:p>
+    <w:p>
+      <w:r>
+        <w:t xml:space="preserve">      In accordance with the royal rescript, the Lieutenancy Council ordered the national census of the Jews on 23 September 1735. This time too it entrusted the counties, towns and districts with carrying out the census. It informed them of the contents of the royal rescript, sent them the census table, the idea tabellae, and set a deadline of three months. No Lieutenancy Council order went to Máramaros county, since its Chamber return already existed. Nor did the mining towns receive a call from the Lieutenancy Council, nor Nagyszombat, evidently because it was common knowledge that they had no Jewish inhabitants.33</w:t>
+        <w:br/>
+        <w:t xml:space="preserve">      The census ordered in 1735 was carried out comparatively more smoothly than that of ten years before.34 Naturally not every county, town and district kept the three-month deadline – rather those that sent negative reports. The bulk of the returns reached the Lieutenancy Council in 1735 and 1736; on 18 December 1736 it sent reminders to a further 15 counties and 2 towns.35 In response to the reminder further returns or negative reports came in in 1737 and 1738, and Ung county sent its return only in 1739 [OCR: '173H'].</w:t>
+        <w:br/>
+        <w:t xml:space="preserve">      In the end the returns of 31 counties and 8 towns were completed, as against the 36 and 7 returns, respectively, of the 1720s. Of the counties, 7 sent neither a return nor a negative report: Gömör, Nógrád, Szabolcs, Szatmár and Torna in Hungary proper, and Közép Szolnok and Kraszna in the Partium.</w:t>
+        <w:br/>
+        <w:t xml:space="preserve">      The Partium – with the exception of Zaránd county – no longer fell under the competence of the Lieutenancy Council as regards the census at that time; this is the explanation why Közép Szolnok and Kraszna counties, and likewise Kővár district, sent neither a return nor a negative report.</w:t>
+        <w:br/>
+        <w:t xml:space="preserve">      In the said 5 counties of Hungary proper Jewish inhabitants were enumerated in the 1740s; it may therefore be assumed that in the 1730s they did not prepare returns out of negligence, and not because they had no Jewish inhabitants. Only Gömör county may have been an exception to this, which in the 1720s made a negative report and in the 1740s had only 18 Jewish inhabitants.</w:t>
+      </w:r>
+    </w:p>
+    <w:p>
+      <w:r>
+        <w:t xml:space="preserve">      32 I have translated the Latin questions, or rather column headings, into Hungarian not literally but according to their sense. A copy of this so-called idea tabellae: O. L. Helyt. lvt. Jud. Lad. B. Fasc. 7. No 1. 1735? [OCR: 'Lad, TI. Fas«. i. Ko 1. l7;!IJ.'; reading uncertain] No 1. – The idea tabellae sent to the town of Sopron is published in: M.-Zs. Okl. VI. k. Bp., 1961. pp. 586–587 [OCR garbled; reading probable].</w:t>
+        <w:br/>
+        <w:t xml:space="preserve">      33 Original draft of the Lieutenancy Council's order: O. L. Helyt. lvt. Jud. Idealia. No 1. 1735. szept. 23 [OCR: '2:.L']. – The Lieutenancy Council's order addressed to the town of Pest is published in: M.-Zs. Okl. III. k. Bp. 1937. pp. 694–695 [OCR garbled; page numbers uncertain]. – The Lieutenancy Council's order addressed to the town of Sopron is published in: M.-Zs. Okl. VI. k. Bp., 1961. pp. 587–588.</w:t>
+        <w:br/>
+        <w:t xml:space="preserve">      34 We know only of the difficulty raised by the military command of the fortress of Győr against the county authority. On this see the reports of Győr county dated 14 November 1735 and 17 January 1736: O. L. Helyt. lvt. Jud. No 1. 1735. No 7. 1736. No 8.</w:t>
+        <w:br/>
+        <w:t xml:space="preserve">      35 Original draft of the Lieutenancy Council's order: O. L. Helyt. lvt. Jud. Lad. B. Fasc. 7. No 1. 1736. No 1.</w:t>
+      </w:r>
+    </w:p>
+    <w:p>
+      <w:r>
+        <w:t>60</w:t>
+      </w:r>
+    </w:p>
+    <w:p>
+      <w:pPr>
+        <w:pStyle w:val="Heading1"/>
+      </w:pPr>
+      <w:r>
+        <w:t>PDF viewer page 63</w:t>
+      </w:r>
+    </w:p>
+    <w:p>
+      <w:r>
+        <w:t>https://real-eod.mtak.hu/2973/1/Magyar_zsido_okleveltar_VII.pdf#page=63</w:t>
+      </w:r>
+    </w:p>
+    <w:p>
+      <w:r>
+        <w:t xml:space="preserve">      Negative reports came from 8 counties: Baranya, Bars [OCR: 'BaIB'], Csanád, Csongrád, Hont, Turóc and Zólyom in Hungary proper, and Zaránd in the Partium. Of these, Baranya, Hont, Turóc and Zaránd still had Jewish inhabitants in the 1720s.</w:t>
+        <w:br/>
+        <w:t xml:space="preserve">      The number of towns in which Jews also lived rose in the 1730s from 7 to 8; Bártfa became the eighth. The towns all sent reports, except Nagyszombat and 7 mining towns, from which the Lieutenancy Council did not even request them, because it was common knowledge that no Jews lived in them.</w:t>
+        <w:br/>
+        <w:t xml:space="preserve">      The Jász-Kun district and the Hajdú towns submitted negative reports.</w:t>
+        <w:br/>
+        <w:t xml:space="preserve">      We mentioned that in 1735 the monarch ordered the census of the Jews on the initiative of the Chamber. This is the explanation why on 10 December 1738 the Lieutenancy Council forwarded the returns received thus far to the Hungarian Chamber.36</w:t>
+        <w:br/>
+        <w:t xml:space="preserve">      The Hungarian Chamber had the returns copied. Copies were made of the returns of 29 counties and 8 towns.37 It then sent the original returns back to the Lieutenancy Council on 12 June 1739,38 and they entered the Lieutenancy Council's archive.</w:t>
+        <w:br/>
+        <w:t xml:space="preserve">      Volume III of the Magyar-Zsidó Oklevéltár published the Jewish returns of the towns of Pozsony, Buda, Kismarton and Kőszeg, and of the market town of Óbuda, from the 1730s.39 According to the editor, the returns were in the archive of the Hungarian Chancellery.40 From this one might conclude that the Hungarian Chancellery also had copies made of the returns. There is, however, no other trace of this; at present – to our knowledge – the Jewish returns prepared in the 1730s are not in the archive of the Hungarian Chancellery.</w:t>
+        <w:br/>
+        <w:t xml:space="preserve">      The Jewish census ordered in 1735 was the most uniformly prepared of the national Jewish censuses of the first half of the 18th century. It is among the most valuable historical sources illuminating the economic and social situation of the Jews.41</w:t>
+        <w:br/>
+        <w:t xml:space="preserve">      On the basis of the returns received, the Lieutenancy Council had various, partly fragmentary, statements prepared. The more significant of these are the two which show the Jews under domestic and under foreign hereditary landlords, respectively.42 A summary statement was also prepared of the Jews living in the towns.43</w:t>
+        <w:br/>
+        <w:t xml:space="preserve">      We have no knowledge of the Lieutenancy Council having made a proposal to the monarch, on the basis of the result of the Jewish census carried out in the 1730s,</w:t>
+      </w:r>
+    </w:p>
+    <w:p>
+      <w:r>
+        <w:t xml:space="preserve">      36 Original draft of the Lieutenancy Council's letter: O. L. Helyt. lvt. Jud. No 1. 1738. No 6.</w:t>
+        <w:br/>
+        <w:t xml:space="preserve">      37 As we mentioned, the Lieutenancy Council did not request a return from Máramaros county. Ung county's return arrived only in 1739, so no Chamber copy was made of it either. – The Hungarian Chamber then had the copies bound together. This volume: O. L. Magy. kam. arch. Urb. et consor. Fasc. 71. No 2.</w:t>
+        <w:br/>
+        <w:t xml:space="preserve">      38 Original fair copy of the Hungarian Chamber's letter: O. L. Helyt. lvt. Jud. No 1. 1739. No 4.</w:t>
+        <w:br/>
+        <w:t xml:space="preserve">      39 III. k., Bp., 1937. pp. 699–707, 711–717, 720–727, 743–745, 755–759. – The returns of Pozsony, Kismarton and Óbuda come from the respective county returns.</w:t>
+        <w:br/>
+        <w:t xml:space="preserve">      40 O. L. M. kanc. lvt. Acta part. No 43. The documents relating to the Jewish returns that were under this reference are at present to be found under ibid. [OCR: '1.10.'] Acta part. No 269. Here, however, there are no documents relating to the census of the 1730s.</w:t>
+        <w:br/>
+        <w:t xml:space="preserve">      41 This census – specifically the volume of copies prepared by the Hungarian Chamber – was used by Ignác Acsády in his work Magyarország népessége a pragmatica sanctio korában [The Population of Hungary in the Age of the Pragmatic Sanction]. Bp., 1896.</w:t>
+        <w:br/>
+        <w:t xml:space="preserve">      42 O. L. Jud. Lad. B. Fasc. 7. No 1. 1736. No 4 and No 6 [OCR: ''o 4. és No G.'; readings uncertain].</w:t>
+        <w:br/>
+        <w:t xml:space="preserve">      43 Ibid. 1736. No 5. – The Hajdú towns also appear in this statement, although no Jews lived there.</w:t>
+      </w:r>
+    </w:p>
+    <w:p>
+      <w:r>
+        <w:t xml:space="preserve">                                                                                                        61</w:t>
+      </w:r>
+    </w:p>
+    <w:p>
+      <w:pPr>
+        <w:pStyle w:val="Heading1"/>
+      </w:pPr>
+      <w:r>
+        <w:t>PDF viewer page 64</w:t>
+      </w:r>
+    </w:p>
+    <w:p>
+      <w:r>
+        <w:t>https://real-eod.mtak.hu/2973/1/Magyar_zsido_okleveltar_VII.pdf#page=64</w:t>
+      </w:r>
+    </w:p>
+    <w:p>
+      <w:r>
+        <w:t>for any restriction of the Jews. It did, on 26 [OCR: '2o'; cf. note 44: 26] January 1737, issue a circular in which it instructed the counties, towns and districts to proceed against the Jews in the same way as against vagrants, i.e. to check their identity and, if they had no passport, to arrest them and deport them to their place of domicile. It also ordered that the Jews living in their territory should be given a regular passport if they went anywhere.44 These provisions, however, can hardly be connected with the census; they contain no reference to it either. What was at issue here was the extension of the regulations concerning vagrants to the Jewish population of the country. In his rescript dated 27 February 1737 approving the provision,45 the monarch, too, regarded it only as a temporary measure for the time until the other measures planned for restricting the Jews were introduced, for the sake of which he had ordered both the 1725 and the 1735 census. These further measures, however, did not materialize.46</w:t>
+        <w:br/>
+        <w:t xml:space="preserve">      The two national Jewish censuses of the 1740s took place for an entirely different reason.</w:t>
+        <w:br/>
+        <w:t xml:space="preserve">                                                   *</w:t>
+        <w:br/>
+        <w:t xml:space="preserve">      A brief royal rescript dated 12 February 1743 reached the Lieutenancy Council. The rescript referred to the grave situation of the treasury, which had to be remedied by every possible means. It further referred to the fact that many Jews lived in Hungary. On all these grounds it called upon the Lieutenancy Council to make a proposal for the extraordinary taxation of Hungarian Jewry.47</w:t>
+        <w:br/>
+        <w:t xml:space="preserve">      On the Hungarian Chancellery draft of the royal rescript the note can be read that the king gave the instruction for the provision.48 It is probable, however, that the idea of the extraordinary taxation of Hungarian Jewry, to cover to some extent the costs of the War of the Austrian Succession, arose at the Viennese Court Chamber.</w:t>
+        <w:br/>
+        <w:t xml:space="preserve">      This royal provision introduced the third national census of Hungarian Jewry in the first half of the 18th century. The aim of this census was the extraordinary taxation of the Jews, in contrast to the previous censuses of 1725 and 1735, which were prepared with a public-order purpose, for the restriction of the Jews.</w:t>
+        <w:br/>
+        <w:t xml:space="preserve">      The Lieutenancy Council entrusted one of its councillors, Kristóf Festetics, with making a proposal in the matter. Festetics's opinion was that the extraordinary taxation of the Jews planned by the monarch was not possible. He argued that, under the agreement reached between the monarch and the Estates in the matter of the war tax, everything that belongs to the tax base [is] at the disposal of the Estates</w:t>
+      </w:r>
+    </w:p>
+    <w:p>
+      <w:r>
+        <w:t xml:space="preserve">      44 Original draft of the Lieutenancy Council's circular: O. L. Helyt. lvt. Jud. Idealia. No 1. 1737. jan. 26. – In the same place, the original draft of the Lieutenancy Council's submission to the monarch in the matter.</w:t>
+        <w:br/>
+        <w:t xml:space="preserve">      45 Contemporary official copy of the fair copy of the royal rescript: Ibid. 1737. febr. 25.</w:t>
+        <w:br/>
+        <w:t xml:space="preserve">      46 I mention here that on the occasion of the 1735 Jewish census several counties protested to the Lieutenancy Council against the Jewish tax customary in the 13 Upper Hungarian counties, collected or farmed out by the Szepes Chamber. I do not deal with this question in my study.</w:t>
+        <w:br/>
+        <w:t xml:space="preserve">      47 Original fair copy of the royal rescript: O. L. Helyt. lvt. Jud. Lad. B. Fasc. 7. No 2. 1743. No 1.</w:t>
+        <w:br/>
+        <w:t xml:space="preserve">      48 Original draft of the royal rescript: O. L. M. kanc. lvt. Conc. exp. 1743. Febr. No 31.</w:t>
+      </w:r>
+    </w:p>
+    <w:p>
+      <w:r>
+        <w:t>62</w:t>
+      </w:r>
+    </w:p>
+    <w:p>
+      <w:pPr>
+        <w:pStyle w:val="Heading1"/>
+      </w:pPr>
+      <w:r>
+        <w:t>PDF viewer page 65</w:t>
+      </w:r>
+    </w:p>
+    <w:p>
+      <w:r>
+        <w:t>https://real-eod.mtak.hu/2973/1/Magyar_zsido_okleveltar_VII.pdf#page=65</w:t>
+      </w:r>
+    </w:p>
+    <w:p>
+      <w:r>
+        <w:t>stands. The Jews too belong to the tax base, and therefore only the estates have the right to tax them. By this right the counties levy the war tax on the Jews as well, and on the occasion of the noble insurrection they even levied an extraordinary tax on them. The resolution passed at the diet, which practice has also confirmed, could be changed only at a new diet. There is little hope of that, since at the most recent diet, too, numerous complaints were voiced because the Szepes Chamber taxes the Jews living in the area under its jurisdiction, in the 13 Upper Hungarian counties [OCR: 'a13']. Nor is it worth stirring up the question of taxation for the sake of an extraordinary tax on the Jews, since according to the latest conscription only 2430 Jewish families live in the country.49</w:t>
+        <w:br/>
+        <w:t xml:space="preserve">     The Lieutenancy Council submitted the proposal requested by the ruler on 6 March 1743. In its submission it set out the concerns that Festetics Kristóf had raised, except that it did not mention that the extraordinary taxation of the Jews would bring the treasury no worthwhile profit. Reckoning, however, that the concerns raised would not turn the ruler from the ruler's intention, it also made the requested proposal on the manner of taxation.</w:t>
+        <w:br/>
+        <w:t xml:space="preserve">     It took as its starting point that Article 10 of 1595 had imposed a tax of 50 denars per month on the Jews. On this basis it proposed that every Jew living on separate bread, that is, every Jewish family, should pay a one-time tax of 6 [OCR: 'f)'; the figure 6 is given on p. 66] forints. This extraordinary tax, however, should not affect the right of the counties and towns, nor that of the landlords, to tax the Jews or to collect dues from them. And since some Jews are richer and some poorer, the Jews living in each county or town should themselves apportion among themselves the sum falling on them, collect it themselves, and take it to the county and town treasuries. The counties and towns should then forward it to the war cash offices of the treasury. So that the number of Jewish families on which the extraordinary tax was to be paid could be known, the counties and towns should conscribe the Jews living in their territory and report the result of the conscription to the Lieutenancy Council, which would then report on it to the ruler.50</w:t>
+        <w:br/>
+        <w:t xml:space="preserve">     On 22 March 1743 the ruler replied to the Lieutenancy Council's submission that, for the sake of the desired aim, it should communicate its arguments to the counties and towns and then report on the result.51</w:t>
+        <w:br/>
+        <w:t xml:space="preserve">     The Lieutenancy Council interpreted the somewhat oracular [OCR: 'kicsit rlodonai'; probably 'kissé dodonai' = 'somewhat Delphic/ambiguous'] royal rescript to mean that the king insisted on the extraordinary taxation of the Jews and approved its proposal on the rate and manner of taxation. On 2 April 1743 — in the case of the towns</w:t>
+      </w:r>
+    </w:p>
+    <w:p>
+      <w:r>
+        <w:br/>
+        <w:t xml:space="preserve">      49 Original fair copy of Festetics's report: O. L. Helyt. lvt. Jud. Lad. B. Fase. 7. No 2. 1743. No 2. — Festetics took the figure for the number of Jewish families from the Lieutenancy Council tabulation prepared on the basis of the 1735 conscription. The figure needs to be checked.</w:t>
+        <w:br/>
+        <w:t xml:space="preserve">      50 Original fair copy of the Lieutenancy Council submission: O. L. M. kane. lvt. Litt. cons. 1743. No 122. — Original draft of the submission: O. L. Helyt. lvt, Jud. Lad. B. Fasc, 7. No 2. 1743. No 3.</w:t>
+        <w:br/>
+        <w:t xml:space="preserve">      51 [Latin, translated:] "We have thought it right graciously to rescribe to Your Fidelities further in this matter too, and at the same time to commission that, in order to obtain the desired effect in this business, Your Fidelities should forthwith write out to the counties of the kingdom and to the free and royal cities the motives you have adduced for this purpose, and should take care to inform Our Majesty promptly of what effect these have had and successively produced with them; and let Your same Fidelities not omit this." — Original draft of the royal decree: O. L. M. kanc. lvt. Cane. exp. 1743. Mart. No 88. — Contemporary official copy of the decree: O. L. Helyt. lvt. Jud. Idealia. No 1. 1743. 22 March.</w:t>
+      </w:r>
+    </w:p>
+    <w:p>
+      <w:r>
+        <w:br/>
+        <w:t xml:space="preserve">                                                                                              63</w:t>
+      </w:r>
+    </w:p>
+    <w:p>
+      <w:pPr>
+        <w:pStyle w:val="Heading1"/>
+      </w:pPr>
+      <w:r>
+        <w:t>PDF viewer page 66</w:t>
+      </w:r>
+    </w:p>
+    <w:p>
+      <w:r>
+        <w:t>https://real-eod.mtak.hu/2973/1/Magyar_zsido_okleveltar_VII.pdf#page=66</w:t>
+      </w:r>
+    </w:p>
+    <w:p>
+      <w:r>
+        <w:t>in its circular dated 1 June — it therefore put forward only the arguments that spoke in favour of taxation and kept silent about its concerns. Its chief argument was that the Jews could make many kinds of profit through the war. It meant to give no less weight to the argument that Article 10 of 1595 had already imposed a tax on the Jews, and that the amount of the present tax was the same as that of 1595. It fixed the amount of the one-time extraordinary tax at 6 forints per family, and regarding its assessment and collection it ordered what it had proposed to the ruler. It ordered the counties and towns to conscribe the Jews and to send it the conscriptions, so that it could submit them to the ruler.52</w:t>
+        <w:br/>
+        <w:t xml:space="preserve">        Following this circular of the Lieutenancy Council, dated 2 April and 1 June 1743 respectively, the third national Jewish conscription began. It may be said at the outset that this conscription produced the fewest results. The main reason was that the purpose of the conscription was the taxation of the Jews. Taxation was the most sensitive question of all, one on which ruler and estates were always opposed to each other. The concerns raised by Lieutenancy Councillor Festetics Kristóf in his report all proved well founded. Most of the counties of Hungary were unwilling to acknowledge the ruler's right to tax the Jews separately. These counties — and there was even a town among them — either did not deign to reply to the Lieutenancy Council's circular at all, or replied but lined up arguments in their reply to support their rejection.</w:t>
+        <w:br/>
+        <w:t xml:space="preserve">        It would lead too far, beyond the scope of this study, if I were to set out one by one which county refused the extraordinary taxation of the Jews, when, and on what grounds. In essence, these arguments were the same as the concerns of Festetics Kristóf, who had himself intended his concerns as arguments against the ruler's intention.</w:t>
+        <w:br/>
+        <w:t xml:space="preserve">        When the ruler inquired, in a rescript dated 21 May 1743, what had happened in the matter of the taxation of the Jews,53 the Lieutenancy Council, in its submission dated 24 May 1743, sent the reply it had given to Zala [OCR: 'ZF1la'] and Borsod counties, which had protested against the taxation. It reported that it was giving the same reply to the other protesting counties as well. It would also have given this reply to Pozsony county, which had likewise protested, had that county not indicated that it had sent its protest directly to the king as well.54</w:t>
+        <w:br/>
+        <w:t xml:space="preserve">        The essence of the Lieutenancy Council's reply to the protesting counties was that royal taxation of the Jews did not prevent the counties from also taxing them separately. It further stated that everyone takes an extraordinary share of extraordinary wartime hardships, and that this applies to the Jews as well.</w:t>
+      </w:r>
+    </w:p>
+    <w:p>
+      <w:r>
+        <w:br/>
+        <w:t xml:space="preserve">      52 Original draft of the Lieutenancy Council circular: O. L. Helyt. Ivt. Jud. Idealia. No 1. 1743. 2 April. — The circular went to the counties dated 2 April. Of the towns, only the following received the circular, dated 1 June: Bártfa, Buda, Kőszeg, Modor, Szakolca, Szatmárnémeti, Szentgyörgy, Trencsén and the Hajdú towns. These were the places where, according to one of the Lieutenancy Council's tabulations, Jews were reckoned to be present — in the case of the Hajdú towns, erroneously.</w:t>
+        <w:br/>
+        <w:t xml:space="preserve">      53 [OCR: '5:\\'] Original fair copy of the royal rescript: O. L. Helyt. lvt. Jud. Lad. B. Fase. 7. No 2. 1743. No 9. — Original draft of the rescript: O. L. M. ka ne. Jvt. Cone. exp. 1743. Mai. No 55.</w:t>
+        <w:br/>
+        <w:t xml:space="preserve">      54 Original fair copy of the Lieutenancy Council submission: O. L. M. kanc. lvt. Litt. cons. 1743. No 238. — Original draft of the submission: O. L. Helyt. lvt. Jud. Lad. B. Fasc. '7. No 2. 1743. No 10.</w:t>
+      </w:r>
+    </w:p>
+    <w:p>
+      <w:r>
+        <w:br/>
+        <w:t>·64</w:t>
+      </w:r>
+    </w:p>
+    <w:p>
+      <w:pPr>
+        <w:pStyle w:val="Heading1"/>
+      </w:pPr>
+      <w:r>
+        <w:t>PDF viewer page 67</w:t>
+      </w:r>
+    </w:p>
+    <w:p>
+      <w:r>
+        <w:t>https://real-eod.mtak.hu/2973/1/Magyar_zsido_okleveltar_VII.pdf#page=67</w:t>
+      </w:r>
+    </w:p>
+    <w:p>
+      <w:r>
+        <w:t xml:space="preserve">      In a rescript dated 31 May 1743 the ruler asked the Lieutenancy Council what the outcome of the reply given to Zala and Borsod counties had been. At the same time the ruler forwarded the protest that Pozsony county had addressed directly to the ruler, asking for a proposal on how to answer it.55</w:t>
+        <w:br/>
+        <w:t xml:space="preserve">      The Lieutenancy Council did not reply to this royal rescript. The reason was that on 31 May 1743, before receiving the ruler's decree of the same date, it had submitted copies of the protests against the taxation of the Jews that it had received from 10 counties, among them Zala, Borsod and Pozsony.56</w:t>
+        <w:br/>
+        <w:t xml:space="preserve">      The ruler, in turn, did not reply to this Lieutenancy Council submission. It seems that the ruler was waiting for the Lieutenancy Council's reply, while the Council was waiting for the ruler's instructions.</w:t>
+        <w:br/>
+        <w:t xml:space="preserve">      During this period of mutual waiting nothing of substance happened. The Lieutenancy Council contented itself with giving the protesting counties a reply similar to the one it had given Zala and Borsod. These replies were not effective enough to make the counties change their position.</w:t>
+        <w:br/>
+        <w:t xml:space="preserve">      Nearly a year passed in this way. Then the ruler's decree dated 22 May 1744 moved the matter of taxation, and with it the conscription, somewhat further forward. The royal rescript declared that the arguments raised by the counties against the taxation of the Jews were not considered valid. It called on the Lieutenancy Council to do everything in its power to bring the taxation to success as quickly as possible.57</w:t>
+        <w:br/>
+        <w:t xml:space="preserve">     The Lieutenancy Council appointed a four-member committee to clarify the state of the matter and move it forward. The committee proposed that the Lieutenancy Council address a new circular to the counties and towns and set a deadline for paying the tax.58</w:t>
+        <w:br/>
+        <w:t xml:space="preserve">      The Lieutenancy Council acted on the committee's proposal. On 6 June 1744 it reported to the ruler that it had addressed a circular to the counties, towns and districts, setting St. Michael's Day, that is, 29 September, as the deadline for the tax.59</w:t>
+        <w:br/>
+        <w:t xml:space="preserve">     We would be mistaken, however, to think that the Lieutenancy Council's new circular was more successful than the earlier one. Sopron county, for example, in its letter dated 25 August 1744, again refused to tax the Jews. In its reply dated 25 September 1744 [OCR: 'lí44'], the Lieutenancy Council explained that the ruler had the right to tax the Jews and again called on the county to carry out the decree</w:t>
+      </w:r>
+    </w:p>
+    <w:p>
+      <w:r>
+        <w:t xml:space="preserve">       55 Original fair copy of the royal rescript: O. L. Helyt. lvt. Jud. Lad. B. Fase. 7. No 2. 1743 No 12. With it, the contemporary official copy of Pozsony county's protest dated [day illegible in OCR: 'Itr-ón'] May 1743. — Original draft of the rescript: O. L. M. Icaric. lvt. Conc, exp. 1743. -Iun, No 13.</w:t>
+        <w:br/>
+        <w:t xml:space="preserve">      56 Original fair copy of the Lieutenancy Council submission: O. L. :\1. kanc, lvt. Litt. cons. 1743. No 255. — Original draft: O. L. Helyt. lvt. Jud. Lad. TI. Fase. 7. No 2. 1743. No 13. — The 10 counties: Abaújvár, Borsod, Fejér, Győr, Nógrád, Pest, Pozsony, Trencsén, Zala and Zemplén.</w:t>
+        <w:br/>
+        <w:t xml:space="preserve">      57 Original draft of the royal rescript: O. L. 1\1.kanc, lvt. Cone. exp. 1744. Mai. No 58.</w:t>
+        <w:br/>
+        <w:t xml:space="preserve">      58 Original fair copy of the committee's report: O. L. Helyt. lvt. Jud. Lad. B. Fase. 7. No 2. 1744. No 1. — The members of the committee were Pehm András, Ordódy Lajos László, Schlessberg [OCR: 'Soh lcssbcrg'] László and Domsics [OCR: 'Domsies'] Mihály.</w:t>
+        <w:br/>
+        <w:t xml:space="preserve">      59 Original fair copy of the Lieutenancy Council submission: O. L. M. ka ne. lvt. Litt. cons. 1744. No 191. — Original draft: O. L. Helyt. IvL Jud. Lad. B. Eusc. 7. No 2. 1744. No 2.</w:t>
+      </w:r>
+    </w:p>
+    <w:p>
+      <w:r>
+        <w:t>5 Oklevéltár   VII. [signature mark]</w:t>
+        <w:br/>
+        <w:t xml:space="preserve">                                                                                                    65</w:t>
+      </w:r>
+    </w:p>
+    <w:p>
+      <w:pPr>
+        <w:pStyle w:val="Heading1"/>
+      </w:pPr>
+      <w:r>
+        <w:t>PDF viewer page 68</w:t>
+      </w:r>
+    </w:p>
+    <w:p>
+      <w:r>
+        <w:t>https://real-eod.mtak.hu/2973/1/Magyar_zsido_okleveltar_VII.pdf#page=68</w:t>
+      </w:r>
+    </w:p>
+    <w:p>
+      <w:r>
+        <w:t>It also sent the text of its reply to the county to the ruler, in its submission dated 25 September 1744. Maria Theresa dealt with the matter in person as well. Maria Theresa's autograph note sheds light on why the government did not act more forcefully against the counties. There was a war, and the fate of the empire depended not least on the attitude of the Hungarian estates. This explains the helplessness, or rather the compromising attitude, of the government authorities. The Lieutenancy Council's submission in the Sopron matter was simply noted and filed; this was the decision of the Hungarian Chancellery at its council session held on 5 October 1744 [OCR: 'okt. ő-én'; day probably 5].60</w:t>
+        <w:br/>
+        <w:t xml:space="preserve">     Many more examples like that of Sopron could be listed. Vasvár county intended to use the Jewish tax it had collected for the purposes of the noble insurrection. As it wrote in its letter dated 15 September 1744, the tax of the Jews had always been used to cover county needs, and only the diet could change this practice. The Lieutenancy Council wrote to Vasvár county as well that taxing the Jews was the ruler's sovereign right, and called on it to pay the collected Jewish tax into the war cash office. In this matter too it addressed a submission to the ruler, which met the same fate as its predecessor in the Sopron matter mentioned above.61</w:t>
+        <w:br/>
+        <w:t xml:space="preserve">     Receiving no further instructions from the ruler, the Lieutenancy Council contented itself with waiting for the county reports. Meanwhile it tried to convince the opposing counties, by written arguments, that their position was wrong, and repeatedly ordered them to carry out the decree that had been issued.</w:t>
+        <w:br/>
+        <w:t xml:space="preserve">     The Michaelmas deadline had long passed when the ruler, in a rescript dated 4 December 1744, called on the Lieutenancy Council to report again on the result of the taxation and also to submit the Jewish conscriptions it had received.62</w:t>
+        <w:br/>
+        <w:t xml:space="preserve">     The Lieutenancy Council replied to the ruler's request on 18 December 1744 [OCR: 'lS-án'; probably 18]. It submitted a tabulation of the state of the Jewish tax. The tabulation showed that, of the country's 44 counties,63 only 7 had conscribed the Jews, 7 reported that they had no Jewish inhabitants, 14 had not replied to the Lieutenancy Council's decrees, and 16 [OCR: 'Hi'; 16 is consistent with the total of 44] had refused to carry them out. — The situation was more favourable with the towns. Of the 8 towns in which Jews lived, only Buda refused to carry out the decree. Kőszeg, Szatmárnémeti and Szentgyörgy did not reply. Bártfa, Modor, Szakolca and Trencsén conscribed the Jews. — The Hajdú towns and the Jász-Kun district had no Jewish inhabitants.64</w:t>
+      </w:r>
+    </w:p>
+    <w:p>
+      <w:r>
+        <w:br/>
+        <w:t xml:space="preserve">      60 Original fair copy of the Lieutenancy Council submission: O. L. M. kanc, lvt. Litt. cons. 1744. No 326. — With it, Maria Theresa's autograph note on the matter. — Original draft of the submission: O. L. Helyt. Ivt. Jud. Lad. B. Fasc. 7. No 2. 1744. No 3.</w:t>
+        <w:br/>
+        <w:t xml:space="preserve">      61 Original fair copy of the Lieutenancy Council submission dated 2 October 1744: O. L. M. kanc. Ivt. Litt. eons. 1744. No 339. — Original draft of the submission: O. L. Helyt. lvt. Jud. Lad. B. Fase. 7. No 2. 1744. No 4.</w:t>
+        <w:br/>
+        <w:t xml:space="preserve">      62 Original fair copy of the royal rescript: O. L. Helyt. lvt. Jud. Lad. B. Fasc. 7. No 2. 1744. No 5.</w:t>
+        <w:br/>
+        <w:t xml:space="preserve">      63 Of the Partium, only Zaránd county appears in the tabulation; Közép Szolnok and Kraszna counties, as well as Kővár district, did not fall under the Lieutenancy Council's jurisdiction.</w:t>
+        <w:br/>
+        <w:t xml:space="preserve">      64 Original fair copy of the Lieutenancy Council submission: O. L. M. kane. lvt. Litt. COllS. 1745. No 38. With it, the tabulation. — Original draft of the submission: O. L. Helyt. lvt. Jud. Lad. B. Fasc. 7. No 2. 1744. No 6.</w:t>
+      </w:r>
+    </w:p>
+    <w:p>
+      <w:r>
+        <w:br/>
+        <w:t>66</w:t>
+      </w:r>
+    </w:p>
+    <w:p>
+      <w:pPr>
+        <w:pStyle w:val="Heading1"/>
+      </w:pPr>
+      <w:r>
+        <w:t>PDF viewer page 69</w:t>
+      </w:r>
+    </w:p>
+    <w:p>
+      <w:r>
+        <w:t>https://real-eod.mtak.hu/2973/1/Magyar_zsido_okleveltar_VII.pdf#page=69</w:t>
+      </w:r>
+    </w:p>
+    <w:p>
+      <w:r>
+        <w:t xml:space="preserve">       On 18 February 1745 [OCR: 'febr. 1S-án'; note 65 gives febr. 18] the ruler ordered the counties and towns to proceed more vigorously in taxing the Jews.65</w:t>
+        <w:br/>
+        <w:t xml:space="preserve">       On 13 March 1745 the Lieutenancy Council reported to the ruler that a further 5 counties and 1 town (Buda) had complied with the decrees on the conscription and taxation of the Jews.66</w:t>
+        <w:br/>
+        <w:t xml:space="preserve">       After this, no significant developments occurred in the matter of the Jewish conscription and taxation ordered in 1743. Conscriptions arrived from 2 more counties and 2 towns (Győr and Kőszeg). The remaining counties and towns either protested in writing or expressed their protest by not replying to the Lieutenancy Council at all.</w:t>
+        <w:br/>
+        <w:t xml:space="preserve">      The Lieutenancy Council, for its part, contented itself with forwarding copies of the letters received from the counties to the ruler, where they ended up in the archive of the Hungarian Chancellery.</w:t>
+        <w:br/>
+        <w:t xml:space="preserve">       The ruler's last disposition concerning the 6-forint-per-family tax and the related conscription was dated 14 June 1745. In it the Lieutenancy Council was called on to report regularly when, from where, and how much Jewish tax came in.67 By then, however, more than three years after the taxation and conscription had been ordered, no further results could be expected.</w:t>
+        <w:br/>
+        <w:t xml:space="preserve">       Summing up the result of the 1743 Jewish conscription, we can establish that of the 4 national Jewish conscriptions held in the first half of the 18th century, this one was the least successful. Of the country's 44 counties,68 only 14 complied with the Lieutenancy Council's decree: Abaújvár, Arad, Bács-Bodrog, Bereg, Csanád, Győr, Moson, Pozsony, Sáros, Szepes, Trencsén, Vasvár, Veszprém and Zala. For two of these, Pozsony and Vasvár, the conscription does not survive among the Lieutenancy Council records. 8 counties reported that they had no Jewish inhabitants: Baranya, Békés, Csongrád, Heves, Hont, Turóc, Zarand and Zólyom. No Jews lived in Bars county either. Finally, 21 counties in which Jews did live refused the conscription and the taxation.</w:t>
+        <w:br/>
+        <w:t xml:space="preserve">       The situation was more favourable with the towns. After Győr was raised to the rank of free royal town, there were by then 9 towns in which Jews lived. Of these, 7 conscribed and taxed their Jewish inhabitants: Bártfa, Buda, Győr, Kőszeg, Modor, Szakolca, Trencsén. Two towns, Szatmárnémeti and Szentgyörgy, did not comply with the Lieutenancy Council's decree.</w:t>
+        <w:br/>
+        <w:t xml:space="preserve">      No Jews lived in the Jász-Kun district or in the Hajdú towns.</w:t>
+        <w:br/>
+        <w:t xml:space="preserve">       If we look for the reason for the failure of the 1743 Jewish conscription, we find it in the balance of power between the ruler and the Hungarian estates. During the years of the War of the Austrian Succession the ruler depended on the support of the Hungarian estates. For this reason the ruler did not act against them with the vigour that could have secured greater success. The ruler did reject the estates' argument that the ruler had no right to impose an extraordinary tax on the Jews, and held fast to the decree. However, the ruler did not do everything possible to have the decree actually carried out, and tolerated opposition to the royal will.</w:t>
+      </w:r>
+    </w:p>
+    <w:p>
+      <w:r>
+        <w:t xml:space="preserve">     65 Original draft of the royal decree: O. L. M. kane. lvt. Cone. exp. 1745. Febr. No 3.8. [OCR; possibly No 38] — Contemporary official copy: O. L. Helyt. lvt. Jud. Idealia. No 1. 1745. 18 Feb.</w:t>
+        <w:br/>
+        <w:t xml:space="preserve">     66 Original fair copy of the Lieutenancy Council submission: O. L. M. kane. lvt. Litt. cons, 1745. No 200.</w:t>
+        <w:br/>
+        <w:t xml:space="preserve">     67 Original draft of the royal decree: O. L. M. kanc. lvt. Cone. exp. 1745. Jun. No 30.</w:t>
+        <w:br/>
+        <w:t xml:space="preserve">     68 Not counting Közép Szolnok and Kraszna, which belonged to the Partium, the number of counties is 44.</w:t>
+      </w:r>
+    </w:p>
+    <w:p>
+      <w:r>
+        <w:br/>
+        <w:t>5*                                                                                            67</w:t>
+      </w:r>
+    </w:p>
+    <w:p>
+      <w:pPr>
+        <w:pStyle w:val="Heading1"/>
+      </w:pPr>
+      <w:r>
+        <w:t>PDF viewer page 70</w:t>
+      </w:r>
+    </w:p>
+    <w:p>
+      <w:r>
+        <w:t>https://real-eod.mtak.hu/2973/1/Magyar_zsido_okleveltar_VII.pdf#page=70</w:t>
+      </w:r>
+    </w:p>
+    <w:p>
+      <w:r>
+        <w:t xml:space="preserve">      As to the question of which side was right in the dispute between the ruler and the estates over the taxation of the Jews, it can hardly be decided. The estates were right that the Jews living in the country belonged to the tax base. Their taxation — whether in the form of war tax or domestic tax — was therefore the right of the counties, towns and districts that held the tax base, and not of the ruler. The ruler, on the other hand, was right that the Jews had become part of the tax base only because they were allowed to live in the country, and permission for this was granted by the ruler, according to the general practice of the age. According to that general practice, the ruler could demand a separate tax from them, a toleration tax, in return for permission to live in the country and for tolerating the Jews there.</w:t>
+        <w:br/>
+        <w:t xml:space="preserve">      How the question was settled ultimately depended on the balance of power between the ruler and the estates. The ruler could conscribe the Jews and tax them for being tolerated in the country only if the counties, towns and districts responsible for carrying out the conscription and taxation could be persuaded or compelled to do so — or else by carrying out the conscription and taxation without them.</w:t>
+        <w:br/>
+        <w:t xml:space="preserve">      The history of the 1743 national Jewish conscription also sheds light on its value as a source. This conscription was completed for far fewer counties and towns than either the 1725 or the 1735 conscription. It is also much poorer than those, containing far less data on the economic and social situation of the Jews. The conscription was made in order to levy the 6-forint [OCR: '(j forintos'] per-family tax. The enumerators therefore often contented themselves with recording the name and place of residence of the head of the family. At other times, however, they prepared a more detailed conscription containing more data. Despite its lack of uniformity and the varying detail of its data, the 1743 conscription is a usable source for the history of Hungarian Jewry. It is regrettable that it was completed, and has survived, for only a relatively small area.</w:t>
+      </w:r>
+    </w:p>
+    <w:p>
+      <w:r>
+        <w:t xml:space="preserve">                                           *</w:t>
+        <w:br/>
+        <w:t xml:space="preserve">      Presumably the relative failure of the 1743 attempt at taxation also played a part in the ruler's decision to try once more to subject Hungarian Jewry to an extraordinary tax. The War of the Austrian Succession was still going on and the treasury was exhausted; these circumstances served as the justification for the new levy.</w:t>
+        <w:br/>
+        <w:t xml:space="preserve">      Maria Theresa ordered the new extraordinary Jewish tax in a rescript addressed to the Lieutenancy Council on 23 May 1746 [OCR: '174G']. The rescript ordered that every Jewish person who wished to be tolerated in the country by the ruler must pay 2 forints to the treasury. This extraordinary tax did not exempt the Jews from other taxes. Every head of family was to pay the tax for the persons belonging to the family, including assistants and male and female servants. The deadline for payment was 3 or 4 weeks after the promulgation of the royal decree. Anyone who failed to pay would pay five times the amount as a penalty. Every customary means, including military execution, could be used to collect the tax. Half of the fivefold penalty was to go to the informer, as well as to the officials taking part in the execution. Every Jew who had not paid this tax was to be regarded as lacking royal protection, as one proscribed. The royal officials could seize such proscribed — that is, rightless — persons together with the goods and other belongings in their possession, and were indeed obliged to arrest them.</w:t>
+      </w:r>
+    </w:p>
+    <w:p>
+      <w:r>
+        <w:t>68</w:t>
+      </w:r>
+    </w:p>
+    <w:p>
+      <w:pPr>
+        <w:pStyle w:val="Heading1"/>
+      </w:pPr>
+      <w:r>
+        <w:t>PDF viewer page 71</w:t>
+      </w:r>
+    </w:p>
+    <w:p>
+      <w:r>
+        <w:t>https://real-eod.mtak.hu/2973/1/Magyar_zsido_okleveltar_VII.pdf#page=71</w:t>
+      </w:r>
+    </w:p>
+    <w:p>
+      <w:r>
+        <w:t xml:space="preserve">      For the purpose of levying the tax, and so that the excessively growing number of Jews could be known precisely, every Jewish person had to be conscribed.</w:t>
+        <w:br/>
+        <w:t xml:space="preserve">      Every county and town was obliged to entrust one of its officials with taxing the Jews, and this official was to receive one percent of the tax collected for the work. This tax collector was to pay the collected tax into the nearest war cash office, together with a list of the persons who had paid.</w:t>
+        <w:br/>
+        <w:t xml:space="preserve">      The conscriptions were to be sent to the Lieutenancy Council, which would submit them to the ruler.</w:t>
+        <w:br/>
+        <w:t xml:space="preserve">      The Lieutenancy Council was obliged to promulgate the royal decree and was responsible for its execution regardless of objections.69</w:t>
+        <w:br/>
+        <w:t xml:space="preserve">      Learning from the experience of the previous conscription and taxation, the ruler at the same time addressed a decree to the lord lieutenants (főispánok) and their administrators. The ruler communicated to them the rescript addressed to the Lieutenancy Council and ordered them to have the royal decree promulgated in their presence. They were further ordered to do everything in their power to carry out the decree, to proceed with full rigour, and to report on the result.70</w:t>
+        <w:br/>
+        <w:t xml:space="preserve">      The Lieutenancy Council sent out the circular ordering the taxation and conscription on 1 June 1746 [OCR: 'jún. ] -én'], in accordance with the royal rescript.71</w:t>
+        <w:br/>
+        <w:t xml:space="preserve">      These measures introduced the fourth national conscription of Hungarian Jewry in the first half of the 18th century.</w:t>
+        <w:br/>
+        <w:t xml:space="preserve">      The purpose of this conscription was the same as that of the preceding one ordered in 1743: this too was a tax conscription. The basis of the tax, however, was now the person rather than the family. This meant that the conscription on which the tax was based had to be more detailed and cover every person.</w:t>
+        <w:br/>
+        <w:t xml:space="preserve">      The levying and collection of the new tax differed somewhat from those of the previous one. Under the previous tax, the Jews had been left to decide how to divide among themselves the tax falling on them. Now every head of family had to pay according to the number of persons belonging to the family. This method of taxation weighed heavily on the poorer families, which in many cases could not pay the amount falling on them at all.</w:t>
+        <w:br/>
+        <w:t xml:space="preserve">      In the new conscription and taxation the ruler threatened much greater severity than had been applied in the previous one. Success again depended on how far the ruler could enforce the royal will, and on how the balance of power between ruler and estates developed.</w:t>
+        <w:br/>
+        <w:t xml:space="preserve">      The new conscription and taxation did not begin under more favourable auspices than the previous one. Most of the counties again took a negative position. On 28 July 1746 [OCR: '] 74G'] the Lieutenancy Council submitted copies of the letters of Pozsony and Komárom counties to the ruler, to show what the situation was.72</w:t>
+        <w:br/>
+        <w:t xml:space="preserve">      The ruler was unwilling to accept the counties' arguments against the extraordinary toleration tax, which were essentially the same as those that</w:t>
+      </w:r>
+    </w:p>
+    <w:p>
+      <w:r>
+        <w:br/>
+        <w:t xml:space="preserve">     69 Original fair copy of the royal decree: O. L. Helyt. lvt. Jud. Lad. B. Fase. 7. No 2.1746. No 1. — Original draft: O. L. M. ka.ne. lvt. Cane. exp. 1746. Mai. No 68.</w:t>
+        <w:br/>
+        <w:t xml:space="preserve">     70 Original draft of the royal decree: O. L. M. kanc, lvt. Cane. exp. 1746. Mai. No 67.</w:t>
+        <w:br/>
+        <w:t xml:space="preserve">     71 Original draft of the Lieutenancy Council circular: O. L. Helyt. lvr. Jud. Idealia. No 1. 1746. 1 June.</w:t>
+        <w:br/>
+        <w:t xml:space="preserve">     72 Original fair copy of the Lieutenancy Council submission: D. L. [OCR; presumably O. L.] M. kane. IvL Litt. eons. 1746. No 321.</w:t>
+      </w:r>
+    </w:p>
+    <w:p>
+      <w:r>
+        <w:br/>
+        <w:t xml:space="preserve">                                                                                                69</w:t>
+      </w:r>
+    </w:p>
+    <w:p>
+      <w:pPr>
+        <w:pStyle w:val="Heading1"/>
+      </w:pPr>
+      <w:r>
+        <w:t>PDF viewer page 72</w:t>
+      </w:r>
+    </w:p>
+    <w:p>
+      <w:r>
+        <w:t>https://real-eod.mtak.hu/2973/1/Magyar_zsido_okleveltar_VII.pdf#page=72</w:t>
+      </w:r>
+    </w:p>
+    <w:p>
+      <w:r>
+        <w:t>had been invoked in previous years as well. The ruler instructed the Lieutenancy Council to enforce the decree of 23 May and to overcome the difficulties raised by the counties.73</w:t>
+        <w:br/>
+        <w:t xml:space="preserve">      In accordance with this royal decree dated 5 August 1746, the Lieutenancy Council rejected the protests of Pozsony, Komárom and several other counties against the taxation of the Jews.74</w:t>
+        <w:br/>
+        <w:t xml:space="preserve">      On 19 August 1746 the Lieutenancy Council submitted to the ruler the first summary tabulation of the county, town and district replies received up to that point.75 The 3–4-week deadline originally set had long passed, yet few replies had arrived, and a considerable part of these were negative.</w:t>
+        <w:br/>
+        <w:t xml:space="preserve">      Besides the counties' protests on grounds of principle, a new difficulty arose: what should be done with the poor Jews who could not pay the 2 forints per person? Referring to a letter from Zemplén county, the Lieutenancy Council set out this difficulty before the ruler in its submission of 6 September 1746.76</w:t>
+        <w:br/>
+        <w:t xml:space="preserve">      The ruler did not reply to this submission. Instead, in a rescript dated 12 September 1746, the ruler expressed dissatisfaction with what had been done so far in the matter of the conscription and taxation. The ruler set a new one-month deadline for the conscription and the payment of the tax, and ordered military execution against all who failed to pay within this deadline.</w:t>
+        <w:br/>
+        <w:t xml:space="preserve">      Military execution had already been mentioned in the royal decree of 23 May, and some counties had in fact used this means.77 A new element, however, was the ruler's decision to involve the country or provincial commissariat organization in carrying out the taxation and conscription. The rescript ordered that the Jews must prove before the provincial commissary of the relevant district that they had paid the tax. Otherwise the provincial commissary would carry out military execution against them.78</w:t>
+        <w:br/>
+        <w:t xml:space="preserve">      Involving the provincial commissariat organization in carrying out the conscription and taxation proved a decisive step. This organization depended far more on the Lieutenancy Council and the ruler than the counties, towns and districts did. It was therefore much better suited to enforcing the royal will, relying on the strength of the troops stationed in the country.</w:t>
+        <w:br/>
+        <w:t xml:space="preserve">      The Lieutenancy Council informed the provincial commissaries of the ruler's decision on 16 September 1746 [OCR: '174G. szept. Hi-án'; day uncertain, cf. note 79].79 At the same time it informed the counties, towns and districts of the same.80</w:t>
+        <w:br/>
+        <w:t xml:space="preserve">      One consequence of the provincial commissariat's involvement in carrying out the taxation and conscription was that the counties, towns and districts</w:t>
+      </w:r>
+    </w:p>
+    <w:p>
+      <w:r>
+        <w:t xml:space="preserve">      73 [OCR: '70'] Original fair copy of the royal rescript dated 5 August 1746 [OCR: '174ö. aug. ö-én']: O. L. llelyt. lvt. Jud- Lad. B. Fase. 7. No 2. 1746. No 5. — Original draft: O. L. ~L kane. lvt. Cone. exp. 1746. Aug. No 30.</w:t>
+        <w:br/>
+        <w:t xml:space="preserve">      74 Original draft of the Lieutenancy Council decree dated 9 August 1746: O. L. Helyt. Ivt. Jud. Lad. B. Fasc. 7. No 2. 1746. No 6.</w:t>
+        <w:br/>
+        <w:t xml:space="preserve">      75 Original fair copy of the submission: O. L. M. kanc. lvt. Litt. cons. 1746. No 375.</w:t>
+        <w:br/>
+        <w:t xml:space="preserve">      76 Original fair copy of the submission: O. L. M. kane.lvt. Litt. cons. 1746. No 410.</w:t>
+        <w:br/>
+        <w:t xml:space="preserve">      77 E.g. Ung county. O. L. M. kanc. lvt. Litt. COllS. 1746. No 375.</w:t>
+        <w:br/>
+        <w:t xml:space="preserve">      78 Original fair copy of the royal rescript: O. L. Helyt. lvt. Jud. Lad. B. Fasc. 7. No 2. 1746. No 9. — Original draft: O. L. M. kanc, lvt. Cone. exp. 1746. Sept. No 45.</w:t>
+        <w:br/>
+        <w:t xml:space="preserve">      79 Original draft of the Lieutenancy Council circular: O. L. Helyt. lvt. Jud. Idealia. [OCR line garbled: 't. 16.'; reference partly illegible]</w:t>
+        <w:br/>
+        <w:t xml:space="preserve">      80 Ibid.</w:t>
+      </w:r>
+    </w:p>
+    <w:p/>
+    <w:p>
+      <w:r>
+        <w:br/>
+        <w:t>70</w:t>
+      </w:r>
+    </w:p>
+    <w:p>
+      <w:pPr>
+        <w:pStyle w:val="Heading1"/>
+      </w:pPr>
+      <w:r>
+        <w:t>PDF viewer page 73</w:t>
+      </w:r>
+    </w:p>
+    <w:p>
+      <w:r>
+        <w:t>https://real-eod.mtak.hu/2973/1/Magyar_zsido_okleveltar_VII.pdf#page=73</w:t>
+      </w:r>
+    </w:p>
+    <w:p>
+      <w:r>
+        <w:t>the Jewish conscriptions had to be sent not only to the Lieutenancy Council [helytartótanács] but also to the provincial commissioners. It happened that the conscriptions were sent only to the competent provincial commissioner.</w:t>
+        <w:br/>
+        <w:t xml:space="preserve">      It would be a mistake to think that from then on taxation and conscription took place without any obstacle or complication. Such cases continued to occur. It happened that the Jews were conscribed not by the competent county, town or district, but by a chamber [kamarai] or military authority.81 It was a frequent occurrence that the tax was not paid into the competent war treasury [hadipénztár].82 Sopron county wanted to redeem the tax of the Jews living on its territory in a single sum of 300 gold ducats, to which the ruler did not consent.83 There were difficulties concerning the payment of the one percent due to the tax administrators.84 I consider that a description of cases similar to these may be omitted within the limits of my study.</w:t>
+        <w:br/>
+        <w:t xml:space="preserve">      Such difficulties, however, essentially only delayed, but did not prevent, the Jews from being continuously conscribed and taxed everywhere they lived. The director of the provincial commissariat, Count Balassa Pál, informed the Lieutenancy Council, of which he was himself one of the councillors, of the progress of conscription and taxation. The Lieutenancy Council in turn forwarded these reports to the ruler, on the basis of which the Hungarian Court Chancellery from time to time also sent statements to the Court Chamber in Vienna.85</w:t>
+        <w:br/>
+        <w:t xml:space="preserve">      From the report of the Lieutenancy Council dated 30 June 1747 [OCR; footnote 85 gives 20 June 1747 for the submission], submitting the letter and statement written by Count Balássa Pál on 19 June 1747, the ruler was, however, able to establish that some counties had not yet executed the decrees, while others had remained in arrears. He therefore ordered that the Lieutenancy Council should now no longer address summonses to the counties, but proceed with the utmost rigour. The provincial commissioners were to collect the outstanding Jewish tax with military assistance.86</w:t>
+      </w:r>
+    </w:p>
+    <w:p>
+      <w:r>
+        <w:br/>
+        <w:t xml:space="preserve">       81 E.g. the Jews of Nagyvárad were conscribed by a military authority, those of Arad by a chamber authority. O. L. M. kane. lvt. Ins. eons. bell. 1746. No 131. - O. L. Helyt. lvt. Jud. Lad. B. Fase. 7. No 2. 1746. No 14.</w:t>
+        <w:br/>
+        <w:t xml:space="preserve">       82 E.g. the Jews of Pétervárad paid the tax into the chamber treasury. The Lieutenancy Council ordered that Bács county should reclaim the taxa from there and pay it into the war treasury. O. L. Helyt. lvt. Jud. Lad. B. Fase. 7. No 2. 1746. No 16.</w:t>
+        <w:br/>
+        <w:t xml:space="preserve">       83 [OCR "8:10."; footnote number 83 followed by "O."] O. L. M. kanc. lvt. Cone. exp. 1746. Oet. No 66. - O. L. Helyt. lvt. Jud. Lad. B. Fase. 7. No 2. 1746. No 15.</w:t>
+        <w:br/>
+        <w:t xml:space="preserve">       84 O. L. M. kanc, lvt. Litt. eons. 1746. No 472. - Ibid. Cone. exp. 1746. Nov. No 103.</w:t>
+        <w:br/>
+        <w:t xml:space="preserve">       85 The ruler requested information from the Lieutenancy Council on 4 May 1747. O. L. M. kanc. lvt. Cone. exp. 1747. Mai. No 16. - At the same time the Hungarian Chancellery informed the Court Chamber of the results achieved so far. Ibid. 1746. Mai. No 88. - On 17 May 1747 the Lieutenancy Council informed the ruler of the further replies received up to the end of February 1747. O. L. M. kanc, lvt. Litt. cons. 1747. No 198. - Count Balassa Pál, director of the provincial commissariat, sent a statement to the Lieutenancy Council on 19 June 1747 on the state of the taxation. At the same time he asked the Lieutenancy Council to issue a summons to those counties and towns which had not yet executed the decrees. O. L. Helyt. lvt, Jud. Lad. B. Fase. 7. No. 21747. No 1. [OCR "No. 21747." probably "No 2. 1747."] Beside Balassa's letter there are several further statements, namely on the situation as of [OCR "okt. Iü-i"; possibly 10] October 1747, and then from approximately January 1748. - The Lieutenancy Council submitted Balassa's report and statement to the ruler in copy on 20 June 1747. O. L. M. kanc, Ivt. Litt. eons. 1747. No 248. - The Hungarian Chancellery communicated the further developments to the Court Chamber on 30 June 1747. Ibid. Cone. exp. 1746. Jul. No 115.</w:t>
+        <w:br/>
+        <w:t xml:space="preserve">        86 Original draft of the royal decree: O. L. M. kane. lvt. Cone. exp. 1747. Ju!. No 4.</w:t>
+      </w:r>
+    </w:p>
+    <w:p>
+      <w:r>
+        <w:t>[OCR note: archive abbreviations such as "kane.", "eons.", "Cone.", "Fase.", "Oet." are retained as read; they probably stand for kanc., cons., Conc., Fasc., Oct.]</w:t>
+      </w:r>
+    </w:p>
+    <w:p>
+      <w:r>
+        <w:t xml:space="preserve">                                                                                                     71</w:t>
+      </w:r>
+    </w:p>
+    <w:p>
+      <w:pPr>
+        <w:pStyle w:val="Heading1"/>
+      </w:pPr>
+      <w:r>
+        <w:t>PDF viewer page 74</w:t>
+      </w:r>
+    </w:p>
+    <w:p>
+      <w:r>
+        <w:t>https://real-eod.mtak.hu/2973/1/Magyar_zsido_okleveltar_VII.pdf#page=74</w:t>
+      </w:r>
+    </w:p>
+    <w:p>
+      <w:r>
+        <w:t xml:space="preserve">      The Lieutenancy Council communicated the contents of the royal rescript to Count Balassa, who prepared a precise plan for the military enforcement and attached it to his report dated 11 July 1747.87</w:t>
+        <w:br/>
+        <w:t xml:space="preserve">      We have no further information on the manner in which the enforcements were carried out. In the ruler's rescript to the Lieutenancy Council of 1 September 1747 we can read that even then there were still non-payers and persons in arrears.88</w:t>
+        <w:br/>
+        <w:t xml:space="preserve">      Complete collection of the tax, without any arrears, was not achieved even in the end. What the provincial commissariat was able to accomplish, with the cooperation of the military, was that the Jews were conscribed everywhere they lived, the tax was assessed on them, and the greater part of it was actually collected.</w:t>
+        <w:br/>
+        <w:t xml:space="preserve">      Excellent information on the final result of the taxation [OCR "adóstatás"] and the conscription is provided by the statement which was prepared on 25 July 1748 in the office of the provincial commissariat, which Count Balassa Pál, director of the provincial security [OCR "biztonsági"; elsewhere "biztossági" = commissariat] submitted to the Lieutenancy Council on 27 July 1748, and which the latter sent on to the ruler on the very same day.89</w:t>
+        <w:br/>
+        <w:t xml:space="preserve">      It emerges from this statement that in the second half of the 1740s, of the 43 counties90 of Hungary in the narrower sense - without the Partium, from which by then Zaránd county too no longer fell under the jurisdiction of the Lieutenancy Council - 36,91 and of its 37 towns 9,92 had Jewish inhabitants, while in neither of its 2 districts93 did Jews live.</w:t>
+        <w:br/>
+        <w:t xml:space="preserve">      The number of Jewish persons living in the 36 counties and 9 towns was 14847. On them a tax of 2 forints per head was assessed, in total [OCR "2D ü94"; probably 29694] forints. Of this, 25900 forints 45 kreuzers, i.e. more than 87% [OCR "87';;,"], was actually paid in cash. The treasury could be satisfied with this result, especially if we compare it with the failure of the 1743 taxation.</w:t>
+        <w:br/>
+        <w:t xml:space="preserve">      The statement prepared at the provincial commissariat shows the distribution of the number of Jews by provincial commissarial districts, and within these by counties and towns. Below I publish this statement in extract, omitting from it the figures relating to the payment of the tax.</w:t>
+      </w:r>
+    </w:p>
+    <w:p>
+      <w:r>
+        <w:br/>
+        <w:t xml:space="preserve">     87 Original fair copy of Count Balassa Pál's report: O. L. Helyt.lvt. Jud. Lad. B. Fase. 7. No 2. 1747. No 2.</w:t>
+        <w:br/>
+        <w:t xml:space="preserve">       88 Original draft of the royal decree: O. L. M. kane. lvt. Cone. exp. 1747. Sept. No 2.</w:t>
+        <w:br/>
+        <w:t xml:space="preserve">       89 Original fair copy of Count Balássa Pál's report: O. L. Helyt. lvt. Jud. Lad. B. Fase. 7. No 2. 1748. No 2. With it, the original of the statement. - Original fair copy of the Lieutenancy Council's submission: O. L. M. kanc. lvt. Litt. cons, 1748. No 278. With it, a copy of the statement.</w:t>
+        <w:br/>
+        <w:t xml:space="preserve">       90 Counting Bács and Bodrog as one.</w:t>
+        <w:br/>
+        <w:t xml:space="preserve">       91 Baranya, Bars, Csongrád, Heves and Külső Szolnok, Hont, Turóc [OCR "Turóe"] and Zólyom counties had no Jewish inhabitants.</w:t>
+        <w:br/>
+        <w:t xml:space="preserve">       92 Buda, Bártfa, Győr, Komárom, Modor, Szakolca [OCR "Szakolea"], Szatmárnémeti, Szentgyörgy and Trencsén.</w:t>
+        <w:br/>
+        <w:t xml:space="preserve">       93 The Jász-kun district and the Hajdú towns.</w:t>
+      </w:r>
+    </w:p>
+    <w:p>
+      <w:r>
+        <w:br/>
+        <w:t>72</w:t>
+      </w:r>
+    </w:p>
+    <w:p>
+      <w:pPr>
+        <w:pStyle w:val="Heading1"/>
+      </w:pPr>
+      <w:r>
+        <w:t>PDF viewer page 75</w:t>
+      </w:r>
+    </w:p>
+    <w:p>
+      <w:r>
+        <w:t>https://real-eod.mtak.hu/2973/1/Magyar_zsido_okleveltar_VII.pdf#page=75</w:t>
+      </w:r>
+    </w:p>
+    <w:p>
+      <w:r>
+        <w:t>County, town, district:                                   Number of Jews:</w:t>
+      </w:r>
+    </w:p>
+    <w:p>
+      <w:r>
+        <w:t xml:space="preserve">             Pozsony district</w:t>
+      </w:r>
+    </w:p>
+    <w:p>
+      <w:r>
+        <w:t xml:space="preserve">  Pozsony county                                              2117</w:t>
+        <w:br/>
+        <w:t xml:space="preserve">        Pozsony town</w:t>
+        <w:br/>
+        <w:t xml:space="preserve">        Szentgyörgy town                                         7</w:t>
+        <w:br/>
+        <w:t xml:space="preserve">        Bazin town</w:t>
+        <w:br/>
+        <w:t xml:space="preserve">        Modor town   J                                           3</w:t>
+        <w:br/>
+        <w:t xml:space="preserve">        Nagyszombat town</w:t>
+        <w:br/>
+        <w:t xml:space="preserve">  Nyitra county                                               2357</w:t>
+        <w:br/>
+        <w:t xml:space="preserve">        Szakolca town                                           96</w:t>
+        <w:br/>
+        <w:t xml:space="preserve">  Trencsén county                                              692</w:t>
+        <w:br/>
+        <w:t xml:space="preserve">        Trencsén town                                          131</w:t>
+        <w:br/>
+        <w:t xml:space="preserve">  Moson county                                                 589</w:t>
+        <w:br/>
+        <w:t xml:space="preserve">  Győr county                                                  120</w:t>
+        <w:br/>
+        <w:t xml:space="preserve">        Győr town                                               51</w:t>
+        <w:br/>
+        <w:t xml:space="preserve">  Komárom county                                               110</w:t>
+        <w:br/>
+        <w:t xml:space="preserve">        Komárom town                                            34</w:t>
+        <w:br/>
+        <w:t xml:space="preserve">                                              Total           6307</w:t>
+      </w:r>
+    </w:p>
+    <w:p>
+      <w:r>
+        <w:t>[OCR: the "J" after Modor may be a bracket in the original; the line attribution of the figure 3 is uncertain]</w:t>
+      </w:r>
+    </w:p>
+    <w:p>
+      <w:r>
+        <w:t xml:space="preserve">             Besztercebánya district</w:t>
+        <w:br/>
+        <w:t xml:space="preserve">  Árva county                                                   27</w:t>
+        <w:br/>
+        <w:t xml:space="preserve">  Liptó county                                                  51</w:t>
+        <w:br/>
+        <w:t xml:space="preserve">  Turóc county</w:t>
+        <w:br/>
+        <w:t xml:space="preserve">  Bars county</w:t>
+        <w:br/>
+        <w:t xml:space="preserve">        Körmöcbánya town</w:t>
+        <w:br/>
+        <w:t xml:space="preserve">        Újbánya town</w:t>
+        <w:br/>
+        <w:t xml:space="preserve">  Zólyom county</w:t>
+        <w:br/>
+        <w:t xml:space="preserve">        Besztercebánya town</w:t>
+        <w:br/>
+        <w:t xml:space="preserve">        Breznóbánya town</w:t>
+        <w:br/>
+        <w:t xml:space="preserve">        Libetbánya town</w:t>
+        <w:br/>
+        <w:t xml:space="preserve">        Zólyom town</w:t>
+        <w:br/>
+        <w:t xml:space="preserve">        Korpona town</w:t>
+        <w:br/>
+        <w:t xml:space="preserve">  Hont county</w:t>
+        <w:br/>
+        <w:t xml:space="preserve">        Selmecbánya town</w:t>
+        <w:br/>
+        <w:t xml:space="preserve">        Bakabánya town</w:t>
+        <w:br/>
+        <w:t xml:space="preserve">        Bélabánya town</w:t>
+        <w:br/>
+        <w:t xml:space="preserve">                                              Total             78</w:t>
+      </w:r>
+    </w:p>
+    <w:p>
+      <w:r>
+        <w:t xml:space="preserve">                                                                         73</w:t>
+      </w:r>
+    </w:p>
+    <w:p>
+      <w:pPr>
+        <w:pStyle w:val="Heading1"/>
+      </w:pPr>
+      <w:r>
+        <w:t>PDF viewer page 76</w:t>
+      </w:r>
+    </w:p>
+    <w:p>
+      <w:r>
+        <w:t>https://real-eod.mtak.hu/2973/1/Magyar_zsido_okleveltar_VII.pdf#page=76</w:t>
+      </w:r>
+    </w:p>
+    <w:p>
+      <w:r>
+        <w:t xml:space="preserve">         County, town, district:                                 Number of Jews:</w:t>
+      </w:r>
+    </w:p>
+    <w:p>
+      <w:r>
+        <w:t xml:space="preserve">                     Sopron district</w:t>
+        <w:br/>
+        <w:t xml:space="preserve">           Sopron county                                             1313</w:t>
+        <w:br/>
+        <w:t xml:space="preserve">                 Sopron town</w:t>
+        <w:br/>
+        <w:t xml:space="preserve">                 Ruszt town</w:t>
+        <w:br/>
+        <w:t xml:space="preserve">                 Kismarton town</w:t>
+        <w:br/>
+        <w:t xml:space="preserve">           Vasvár county [as in OCR]                                 1137</w:t>
+        <w:br/>
+        <w:t xml:space="preserve">                 Kőszeg town</w:t>
+        <w:br/>
+        <w:t xml:space="preserve">           Zala county                                                336</w:t>
+        <w:br/>
+        <w:t xml:space="preserve">           Veszprém county                                            327</w:t>
+        <w:br/>
+        <w:t xml:space="preserve">           Somogy county                                              273</w:t>
+        <w:br/>
+        <w:t xml:space="preserve">                                                    Total            3386</w:t>
+      </w:r>
+    </w:p>
+    <w:p>
+      <w:r>
+        <w:br/>
+        <w:t xml:space="preserve">                     Buda district [OCR "Budai 'terület"]</w:t>
+        <w:br/>
+        <w:t xml:space="preserve">           Pest-Pilis-Solt county                                     626</w:t>
+        <w:br/>
+        <w:t xml:space="preserve">                 Buda town94                                          187</w:t>
+        <w:br/>
+        <w:t xml:space="preserve">                 Pest town</w:t>
+        <w:br/>
+        <w:t xml:space="preserve">           Nógrád county                                              153</w:t>
+        <w:br/>
+        <w:t xml:space="preserve">           Heves and Külső Szolnok county</w:t>
+        <w:br/>
+        <w:t xml:space="preserve">                 Jász-kun district</w:t>
+        <w:br/>
+        <w:t xml:space="preserve">                 Eger town95</w:t>
+        <w:br/>
+        <w:t xml:space="preserve">           Esztergom county                                           136</w:t>
+        <w:br/>
+        <w:t xml:space="preserve">                 Esztergom town</w:t>
+        <w:br/>
+        <w:t xml:space="preserve">           Fejér county                                               320</w:t>
+        <w:br/>
+        <w:t xml:space="preserve">                 Székesfehérvár town</w:t>
+        <w:br/>
+        <w:t xml:space="preserve">           Csongrád county</w:t>
+        <w:br/>
+        <w:t xml:space="preserve">                 Szeged town</w:t>
+        <w:br/>
+        <w:t xml:space="preserve">           Csanád county                                               12</w:t>
+        <w:br/>
+        <w:t xml:space="preserve">           Arad county                                                 56</w:t>
+        <w:br/>
+        <w:t xml:space="preserve">                                                    Total            1390</w:t>
+      </w:r>
+    </w:p>
+    <w:p>
+      <w:r>
+        <w:t>[Note: the figures as read sum to 1490, not 1390; the summary on p. 76 also gives 1390 — probable OCR or source discrepancy in one figure]</w:t>
+      </w:r>
+    </w:p>
+    <w:p>
+      <w:r>
+        <w:t xml:space="preserve">      94 Regarding Buda, the statement remarked that in 1746 many Jews moved away from there to escape the tax. The population figure dates from the time before their departure.</w:t>
+        <w:br/>
+        <w:t xml:space="preserve">      95 Eger was not a royal free town.</w:t>
+      </w:r>
+    </w:p>
+    <w:p>
+      <w:r>
+        <w:br/>
+        <w:t>74</w:t>
+      </w:r>
+    </w:p>
+    <w:p>
+      <w:pPr>
+        <w:pStyle w:val="Heading1"/>
+      </w:pPr>
+      <w:r>
+        <w:t>PDF viewer page 77</w:t>
+      </w:r>
+    </w:p>
+    <w:p>
+      <w:r>
+        <w:t>https://real-eod.mtak.hu/2973/1/Magyar_zsido_okleveltar_VII.pdf#page=77</w:t>
+      </w:r>
+    </w:p>
+    <w:p>
+      <w:r>
+        <w:t xml:space="preserve">       County, town, district:                            Number of Jews:</w:t>
+      </w:r>
+    </w:p>
+    <w:p>
+      <w:r>
+        <w:t xml:space="preserve">                    Kassa district</w:t>
+        <w:br/>
+        <w:t xml:space="preserve">         Abaújvár county                                     206</w:t>
+        <w:br/>
+        <w:t xml:space="preserve">               Kassa town</w:t>
+        <w:br/>
+        <w:t xml:space="preserve">         Zemplén county                                      532</w:t>
+        <w:br/>
+        <w:t xml:space="preserve">         Sáros county                                        269</w:t>
+        <w:br/>
+        <w:t xml:space="preserve">               Eperjes town</w:t>
+        <w:br/>
+        <w:t xml:space="preserve">               Bártfa town                                    12</w:t>
+        <w:br/>
+        <w:t xml:space="preserve">               Szeben town</w:t>
+        <w:br/>
+        <w:t xml:space="preserve">         Szepes county                                        67</w:t>
+        <w:br/>
+        <w:t xml:space="preserve">               Lőcse town</w:t>
+        <w:br/>
+        <w:t xml:space="preserve">               Késmárk town</w:t>
+        <w:br/>
+        <w:t xml:space="preserve">         Gömör county                                         18</w:t>
+        <w:br/>
+        <w:t xml:space="preserve">         Torna county                                         30</w:t>
+        <w:br/>
+        <w:t xml:space="preserve">         Borsod county                                       279</w:t>
+        <w:br/>
+        <w:t xml:space="preserve">         Ung county                                          216</w:t>
+        <w:br/>
+        <w:t xml:space="preserve">         Bereg county                                        272</w:t>
+        <w:br/>
+        <w:t xml:space="preserve">                                              Total         1901</w:t>
+      </w:r>
+    </w:p>
+    <w:p>
+      <w:r>
+        <w:br/>
+        <w:t xml:space="preserve">                    Debrecen district [OCR "l)ebreceni"]</w:t>
+        <w:br/>
+        <w:t xml:space="preserve">         Mármaros county                                     348</w:t>
+        <w:br/>
+        <w:t xml:space="preserve">         Szatmár county                                      346</w:t>
+        <w:br/>
+        <w:t xml:space="preserve">               Szatmárnémeti town                             19</w:t>
+        <w:br/>
+        <w:t xml:space="preserve">         Nagybánya town</w:t>
+        <w:br/>
+        <w:t xml:space="preserve">         Szabolcs county                                     221</w:t>
+        <w:br/>
+        <w:t xml:space="preserve">               Hajdú towns</w:t>
+        <w:br/>
+        <w:t xml:space="preserve">               Polgári96</w:t>
+        <w:br/>
+        <w:t xml:space="preserve">         Bihar county                                        252</w:t>
+        <w:br/>
+        <w:t xml:space="preserve">               Debrecen town</w:t>
+        <w:br/>
+        <w:t xml:space="preserve">         Békés county                                          5</w:t>
+        <w:br/>
+        <w:t xml:space="preserve">         Ugocsa county                                       135</w:t>
+        <w:br/>
+        <w:t xml:space="preserve">                                              Total         1326</w:t>
+      </w:r>
+    </w:p>
+    <w:p>
+      <w:r>
+        <w:t>96   Polgári was not a royal free town.</w:t>
+      </w:r>
+    </w:p>
+    <w:p>
+      <w:r>
+        <w:br/>
+        <w:t xml:space="preserve">                                                                          75</w:t>
+      </w:r>
+    </w:p>
+    <w:p>
+      <w:pPr>
+        <w:pStyle w:val="Heading1"/>
+      </w:pPr>
+      <w:r>
+        <w:t>PDF viewer page 78</w:t>
+      </w:r>
+    </w:p>
+    <w:p>
+      <w:r>
+        <w:t>https://real-eod.mtak.hu/2973/1/Magyar_zsido_okleveltar_VII.pdf#page=78</w:t>
+      </w:r>
+    </w:p>
+    <w:p>
+      <w:r>
+        <w:t xml:space="preserve">         County, town, district:                                 Number of Jews:</w:t>
+      </w:r>
+    </w:p>
+    <w:p>
+      <w:r>
+        <w:t xml:space="preserve">                     Eszék district [OCR "Eszéki keridei"]</w:t>
+        <w:br/>
+        <w:t xml:space="preserve">           Baranya county</w:t>
+        <w:br/>
+        <w:t xml:space="preserve">           Tolna county                                              25() [OCR; probably 256]</w:t>
+        <w:br/>
+        <w:t xml:space="preserve">           Bács county                                               144</w:t>
+        <w:br/>
+        <w:t xml:space="preserve">           Bodrog county                                              59</w:t>
+        <w:br/>
+        <w:t xml:space="preserve">                                                    Total             459</w:t>
+      </w:r>
+    </w:p>
+    <w:p>
+      <w:r>
+        <w:br/>
+        <w:t xml:space="preserve">                     Summary</w:t>
+        <w:br/>
+        <w:t xml:space="preserve">           Pozsony district                                         6307 [OCR "ü307"]</w:t>
+        <w:br/>
+        <w:t xml:space="preserve">           Besztercebánya district                                    78</w:t>
+        <w:br/>
+        <w:t xml:space="preserve">           Sopron district                                          3386 [OCR "3:386"]</w:t>
+        <w:br/>
+        <w:t xml:space="preserve">           Buda district                                            1390</w:t>
+        <w:br/>
+        <w:t xml:space="preserve">           Kassa district                                           1901</w:t>
+        <w:br/>
+        <w:t xml:space="preserve">           Debrecen district                                        1326 [OCR "132G"]</w:t>
+        <w:br/>
+        <w:t xml:space="preserve">           Eszék district                                            459</w:t>
+        <w:br/>
+        <w:t xml:space="preserve">                                                    Total          14847</w:t>
+      </w:r>
+    </w:p>
+    <w:p>
+      <w:r>
+        <w:br/>
+        <w:t xml:space="preserve">      Comparing these figures with the data of the earlier 3 national conscriptions, and drawing the conclusions arising from them, is no longer the task of this study.</w:t>
+        <w:br/>
+        <w:t xml:space="preserve">      If we compare the 1746-47 Jewish conscriptions that reached the Lieutenancy Council and have survived among its records with the provincial commissariat statement described above, we must note with regret that the conscription is not available to us for every county and town where, according to the evidence of the statement, Jews lived and where they were in all certainty also conscribed. We find the explanation for this in the fact that, ever since the provincial commissariat became involved in carrying out the taxation and the conscription, the conscriptions were sent primarily there, and not to the Lieutenancy Council. The Lieutenancy Council presumably did not receive the conscriptions from several places. It is probable that it did not even press to receive them, since it was regularly informed of the course of the taxation and the conscription from the reports of the director of the provincial commissariat. The statements sent to the ruler were prepared by the directorate of the provincial commissariat.</w:t>
+        <w:br/>
+        <w:t xml:space="preserve">     Among the records of the Lieutenancy Council, of the 36 counties where Jews lived in 1746-47 [OCR "174G-47"], the Jewish conscriptions of 25 are present. The conscriptions of 11 [OCR "II"] counties are missing: those of Abaújvár, Bács-Bodrog, Bihar, Esztergom, Komárom, Liptó, Moson, Sáros, Sopron, Ugocsa [OCR "Ugoesa"] and Veszprém counties. - With regard to the towns the situation is considerably more favourable; only that of Buda is missing, from where the Jews were expelled in [OCR "174ü"; possibly 1746].</w:t>
+        <w:br/>
+        <w:t xml:space="preserve">     We have no knowledge that the conscriptions of the 1740s were copied either for the Hungarian Chancellery (as in the 1720s) or for the Hungarian Chamber (as in the 1730s), and that they would be extant among the records of these government authorities.</w:t>
+      </w:r>
+    </w:p>
+    <w:p>
+      <w:r>
+        <w:t>76</w:t>
+      </w:r>
+    </w:p>
+    <w:p>
+      <w:pPr>
+        <w:pStyle w:val="Heading1"/>
+      </w:pPr>
+      <w:r>
+        <w:t>PDF viewer page 79</w:t>
+      </w:r>
+    </w:p>
+    <w:p>
+      <w:r>
+        <w:t>https://real-eod.mtak.hu/2973/1/Magyar_zsido_okleveltar_VII.pdf#page=79</w:t>
+      </w:r>
+    </w:p>
+    <w:p>
+      <w:r>
+        <w:t xml:space="preserve">     To our knowledge, not a single conscription from the 1740s has been published so far.</w:t>
+        <w:br/>
+        <w:t xml:space="preserve">     As regards the historical source value of the 1746 conscription, it is considerably greater than that of the 1743 one [OCR "1743-as§"], but does not reach that of the 1735 one. Its chief weakness is that it was not prepared uniformly. In general the Jewish persons were listed by name, not only the heads of families but also the family members; there was, however, also a county which gave only a summary by locality. In one or another of the conscriptions we also find the ages of the persons and the occupation of the head of the family, as well as references to their financial situation.</w:t>
+        <w:br/>
+        <w:t xml:space="preserve">     Despite its lack of uniformity, the 1746 conscription is a source of the first order for the history of Hungarian Jewry.</w:t>
+      </w:r>
+    </w:p>
+    <w:p>
+      <w:r>
+        <w:t xml:space="preserve">                                       *</w:t>
+        <w:br/>
+        <w:t xml:space="preserve">     My aim in this outline of the history of the four national Jewish conscriptions carried out in the first half of the 18th century was to shed light on their origin, and thereby to facilitate the work of those who process the conscriptions. Establishing the abundant knowledge that can be obtained from the conscriptions [OCR "összcfrrisokból"] I did not, as I have already mentioned, regard as my task.</w:t>
+        <w:br/>
+        <w:t xml:space="preserve">     In 1749 the toleration tax [türelmi taxa], which in 1743 and 1746 had still been levied on the Jews of Hungary only in the form of an extraordinary tax, became regular. In connection with the levying of this toleration tax, the Jews were conscribed relatively frequently in the second half of the 18th century and the first half of the 19th century. Clarifying the history of these conscriptions, as well as their publication and the evaluation of their results, is among the primary tasks still awaiting solution in the history of Hungarian Jewry.</w:t>
+      </w:r>
+    </w:p>
+    <w:p>
+      <w:r>
+        <w:t xml:space="preserve">                                                           Ember Győző</w:t>
+      </w:r>
+    </w:p>
+    <w:p>
+      <w:r>
+        <w:br/>
+        <w:t xml:space="preserve">                                                                               77</w:t>
+      </w:r>
+    </w:p>
+    <w:p>
+      <w:pPr>
+        <w:pStyle w:val="Heading1"/>
+      </w:pPr>
+      <w:r>
+        <w:t>PDF viewer page 81</w:t>
+      </w:r>
+    </w:p>
+    <w:p>
+      <w:r>
+        <w:t>https://real-eod.mtak.hu/2973/1/Magyar_zsido_okleveltar_VII.pdf#page=81</w:t>
+      </w:r>
+    </w:p>
+    <w:p>
+      <w:r>
+        <w:t>CHARTULARY [Oklevéltár]</w:t>
+      </w:r>
+    </w:p>
+    <w:p>
+      <w:r>
+        <w:t>VOLUME VII</w:t>
+      </w:r>
+    </w:p>
+    <w:p>
+      <w:r>
+        <w:t>1725-1748</w:t>
+      </w:r>
+    </w:p>
+    <w:p>
+      <w:pPr>
+        <w:pStyle w:val="Heading1"/>
+      </w:pPr>
+      <w:r>
+        <w:t>PDF viewer page 82</w:t>
+      </w:r>
+    </w:p>
+    <w:p>
+      <w:r>
+        <w:t>https://real-eod.mtak.hu/2973/1/Magyar_zsido_okleveltar_VII.pdf#page=82</w:t>
+      </w:r>
+    </w:p>
+    <w:p>
+      <w:r>
+        <w:t>[Blank page]</w:t>
+      </w:r>
+    </w:p>
+    <w:p>
+      <w:pPr>
+        <w:pStyle w:val="Heading1"/>
+      </w:pPr>
+      <w:r>
+        <w:t>PDF viewer page 83</w:t>
+      </w:r>
+    </w:p>
+    <w:p>
+      <w:r>
+        <w:t>https://real-eod.mtak.hu/2973/1/Magyar_zsido_okleveltar_VII.pdf#page=83</w:t>
+      </w:r>
+    </w:p>
+    <w:p>
+      <w:r>
+        <w:t>JEWISH CENSUSES OF COUNTIES AND TOWNS</w:t>
+        <w:br/>
+        <w:t>PURSUANT TO THE DECREE OF THE ROYAL LIEUTENANCY COUNCIL</w:t>
+        <w:br/>
+        <w:t>OF 9 JULY 1725</w:t>
+      </w:r>
+    </w:p>
+    <w:p>
+      <w:r>
+        <w:t>1. Árva County, 21 July 1725, Alsókubin.</w:t>
+        <w:br/>
+        <w:t>2. Győr County, Undated.</w:t>
+        <w:br/>
+        <w:t>3. Hont County, 21 Aug. 1725, Solmecbánya [OCR reading; likely Selmecbánya, cf. no. 3 below].</w:t>
+        <w:br/>
+        <w:t>4. Komárom County, 15 Aug. 1725, Komárom.</w:t>
+        <w:br/>
+        <w:t>5. Mcsori [OCR reading; probably Moson] County, 27 Aug. 1725, Magyaróvár.</w:t>
+        <w:br/>
+        <w:t>6. Nógrád County, 27 Aug. 1725, Losonc.</w:t>
+        <w:br/>
+        <w:t>7. United Pest-Pilis and Solt County, 21 Nov. 1725, Pest.</w:t>
+        <w:br/>
+        <w:t>8. Somogy County, 6 Dec. 1725, Tapsony.</w:t>
+        <w:br/>
+        <w:t>9. Sopron County, 31 Aug. 1725, Sopron.</w:t>
+        <w:br/>
+        <w:t>10. Vasvár County, 20 Oct.-1 Nov. 1725, Jáák.</w:t>
+        <w:br/>
+        <w:t>11. Zemplén County, 8 March 1726, Nagymihály.</w:t>
+      </w:r>
+    </w:p>
+    <w:p>
+      <w:r>
+        <w:t>1. Town of Bazin, 14 Dec. 1725.</w:t>
+        <w:br/>
+        <w:t>2. Town of Buda, 20 July 1725. (Published in M. Zs. O. III. no. 273.)</w:t>
+        <w:br/>
+        <w:t>3. Town of Kőszeg, 21 July 1725.</w:t>
+        <w:br/>
+        <w:t>4. Town of Modor, 20 July 1725.</w:t>
+        <w:br/>
+        <w:t>5. Town of Szakolca, 24 July 1725.</w:t>
+        <w:br/>
+        <w:t>6. Town of Trencsén, 22 July 1725.</w:t>
+      </w:r>
+    </w:p>
+    <w:p>
+      <w:r>
+        <w:t>6 Oklevéltár VII.</w:t>
+        <w:br/>
+        <w:t>81</w:t>
+      </w:r>
+    </w:p>
+    <w:p>
+      <w:pPr>
+        <w:pStyle w:val="Heading1"/>
+      </w:pPr>
+      <w:r>
+        <w:t>PDF viewer page 84</w:t>
+      </w:r>
+    </w:p>
+    <w:p>
+      <w:r>
+        <w:t>https://real-eod.mtak.hu/2973/1/Magyar_zsido_okleveltar_VII.pdf#page=84</w:t>
+      </w:r>
+    </w:p>
+    <w:p>
+      <w:r>
+        <w:t>[Blank page]</w:t>
+      </w:r>
+    </w:p>
+    <w:p>
+      <w:pPr>
+        <w:pStyle w:val="Heading1"/>
+      </w:pPr>
+      <w:r>
+        <w:t>PDF viewer page 85</w:t>
+      </w:r>
+    </w:p>
+    <w:p>
+      <w:r>
+        <w:t>https://real-eod.mtak.hu/2973/1/Magyar_zsido_okleveltar_VII.pdf#page=85</w:t>
+      </w:r>
+    </w:p>
+    <w:p>
+      <w:r>
+        <w:t>1. 21 July 1725. Alsókubin. Only one Jew is found in Árva County.</w:t>
+      </w:r>
+    </w:p>
+    <w:p>
+      <w:r>
+        <w:t>... we report that in this county there is at present only one [person] by the name of the Jews, Abraharaum [OCR; Abraham] Markusz, with Samuel Izak, his relative, and his family, who moreover sells the lord's wine at retail in the market town of Nagy Falu but carries on a rather meagre trade; and we indicate that he has hitherto contributed nothing toward the public burdens ...</w:t>
+        <w:br/>
+        <w:t>Given at our general assembly held in the market town of AIso Kubin, on 21 July 1725.</w:t>
+        <w:br/>
+        <w:t>The Community of the County of Árva.</w:t>
+        <w:br/>
+        <w:t>O. L. Htt. Fasc. Mensium Litt.</w:t>
+      </w:r>
+    </w:p>
+    <w:p>
+      <w:r>
+        <w:br/>
+        <w:t>2. Undated. Census of the Jewry of Győr County.</w:t>
+        <w:br/>
+        <w:t>Census of the Jews residing within the Illustrious County of Győr.</w:t>
+        <w:br/>
+        <w:t>In the Market Town or Fortress of Győr, those placed under the protection of the Government of Győr.</w:t>
+        <w:br/>
+        <w:t>Isác Hiersl with his kin and family, likewise Jacobus Hiersl, likewise with his kin and family, carrying on trade in this place.</w:t>
+        <w:br/>
+        <w:t>In the District of Des ert i [OCR spacing; Deserti].</w:t>
+        <w:br/>
+        <w:t>In Koronczó, Simon Gersel, with wife and children.</w:t>
+        <w:br/>
+        <w:t>In the same place, Moisce Sárner with wife and children.</w:t>
+        <w:br/>
+        <w:t>In the District of Szigetköz.</w:t>
+        <w:br/>
+        <w:t>Ábraham Donath with consort and two sons.</w:t>
+        <w:br/>
+        <w:t>Likewise Marcus, in the same estate, with consort.</w:t>
+        <w:br/>
+        <w:t>In the same place, Samuél Moisis with consort and son.</w:t>
+        <w:br/>
+        <w:t>In the District of Ásvány.</w:t>
+        <w:br/>
+        <w:t>Marcus Ábraham with wife.</w:t>
+        <w:br/>
+        <w:t>O. L. Acta part. s. (1. [archive reference partly illegible in OCR]</w:t>
+      </w:r>
+    </w:p>
+    <w:p>
+      <w:r>
+        <w:br/>
+        <w:t>3. 21 August 1725. Selmecbánya. Report of Hont County on its single Jewish inhabitant.</w:t>
+        <w:br/>
+        <w:t>"... within this County only a single Jew, called Jelen, resides in the Estate of Nénye, otherwise poor, though occasionally carrying on butchery, and he pays absolutely nothing toward the public [burdens]."</w:t>
+        <w:br/>
+        <w:t>O. L. Act. Part. 1725-6. Litterae 1725.augusztus 21.</w:t>
+      </w:r>
+    </w:p>
+    <w:p>
+      <w:r>
+        <w:t>6*</w:t>
+        <w:br/>
+        <w:t>83</w:t>
+      </w:r>
+    </w:p>
+    <w:p>
+      <w:pPr>
+        <w:pStyle w:val="Heading1"/>
+      </w:pPr>
+      <w:r>
+        <w:t>PDF viewer page 86</w:t>
+      </w:r>
+    </w:p>
+    <w:p>
+      <w:r>
+        <w:t>https://real-eod.mtak.hu/2973/1/Magyar_zsido_okleveltar_VII.pdf#page=86</w:t>
+      </w:r>
+    </w:p>
+    <w:p>
+      <w:r>
+        <w:t>4. 15 August 1725. Komárom. Census of the Jews of Komárom County.</w:t>
+      </w:r>
+    </w:p>
+    <w:p>
+      <w:r>
+        <w:t>CENSUS OF THE HEBREWS LIVING IN THE COUNTY OF KOMÁROM</w:t>
+        <w:br/>
+        <w:t>CONDUCTED IN THE YEAR 1725</w:t>
+      </w:r>
+    </w:p>
+    <w:p>
+      <w:r>
+        <w:t>In the year 1725, on the 7th day of the month of August, by virtue of the gracious Mandate of the Exalted Royal Lieutenancy Council, a census of the Jews was made in the District of Győr [Processu Jauriensi] by us, the undersigned Judges, in the following manner and order.</w:t>
+      </w:r>
+    </w:p>
+    <w:p>
+      <w:r>
+        <w:t>IN THE MARKET TOWN OF TATA</w:t>
+      </w:r>
+    </w:p>
+    <w:p>
+      <w:r>
+        <w:t>Salamon Taies [OCR; elsewhere Taics] of Nikolsburg, lessee of the Lord's iron mill [Molae Fertariae, sic], pays the Domain 200 fl. annually. Simon, a Jew, scribe of the said Salamon Taies of Nikolsburg.</w:t>
+        <w:br/>
+        <w:t>Ábraham Salamon, about 34 years old. Trader, born in the Estate of Köpsény in Moson County, has resided here for three years. Pays the Domain 40 fl. Has two sons, two daughters. Has a servant named Abraham, 17 years old.</w:t>
+        <w:br/>
+        <w:t>Simon Farkas. About 5] [OCR; probably 51] years old. Trader, born in the Market Town of Stompha in Pozsony County, has resided here for ]3 [OCR; probably 13] years. Has one son, two daughters. Pays the Domain 40 fl. Also leases a distillery from the Domain for 200 fl. Has two servants, the first named David, about 23 years old, the second Joannes, 15 years old, both from Moravia.</w:t>
+        <w:br/>
+        <w:t>Isaac Markus. About 18 years old. A petty trader, wanders here and there through the villages, married, from Moravia, has resided here for four years.</w:t>
+        <w:br/>
+        <w:t>Jacobus Heisel. About 36 years old. Married, a tailor from Bohemia, has resided here for ] 8 [OCR; probably 18] weeks. Has one son, one daughter.</w:t>
+        <w:br/>
+        <w:t>Isaac Salamon. About 3G [OCR; probably 36] years old. Married, from Moson County, in the Market Town of Rayka. A petty trader, wanders here and there to the villages. Pays the Domain 8 fl. Has 3 sons, 1 daughter, has resided here for G [OCR; probably 6] years.</w:t>
+        <w:br/>
+        <w:t>Ábraham Saehter, about 70 years old, married. A Jewish butcher, from the Market Town of Rahovies (Rohone) in Vas County, has resided here for 6 years.</w:t>
+        <w:br/>
+        <w:t>Jakobus Joachim, about 25 years old, married, a tailor from Bohemia, has resided here for half a year.</w:t>
+        <w:br/>
+        <w:t>Joachim Fridek, from Moravia, married, scribe of Salamon Taics in the iron mill, about 35 years old. Pays the Domain a census of 15 fl.</w:t>
+        <w:br/>
+        <w:t>Salamon Farkas: manual labourer from Bohemia, about 36 years old. Has resided here for 1 year. Pays the Domain a census of 3 fl.</w:t>
+        <w:br/>
+        <w:t>Ábraham Marcus. Manual labourer, married, about 35 years old, from Moravia, has resided here for 1 year. Has one son.</w:t>
+        <w:br/>
+        <w:t>Samuel Moyses, manual labourer, married, about 30 years old, from the Market Town of Köpcsény in Moson County, has resided here for 1 year. Has one son.</w:t>
+        <w:br/>
+        <w:t>Marcus Leb, married, about 2G [OCR; probably 26] years old, from Moravia, has resided here for 2 years, a petty trader, wanders here and there through the villages, has one daughter.</w:t>
+        <w:br/>
+        <w:t>Moyses Leopold, from Moravia, married, about 26 years old, from Moravia, has resided here for 4 years. A petty trader wandering here and there through the villages, has 4 sons, one daughter.</w:t>
+        <w:br/>
+        <w:t>Samuel David, from Gallia, married, about 33 years old, has resided here for 1 year. Overseer of Salamon Taics at the iron mill. Has one son, 4 daughters.</w:t>
+      </w:r>
+    </w:p>
+    <w:p>
+      <w:r>
+        <w:t>84</w:t>
+      </w:r>
+    </w:p>
+    <w:p>
+      <w:pPr>
+        <w:pStyle w:val="Heading1"/>
+      </w:pPr>
+      <w:r>
+        <w:t>PDF viewer page 87</w:t>
+      </w:r>
+    </w:p>
+    <w:p>
+      <w:r>
+        <w:t>https://real-eod.mtak.hu/2973/1/Magyar_zsido_okleveltar_VII.pdf#page=87</w:t>
+      </w:r>
+    </w:p>
+    <w:p>
+      <w:r>
+        <w:t>Abrahamus Kulman, unmarried, from Gallia, about 20 years old. Scribe of Salamon Taics at the iron mill, has resided here for 4 years.</w:t>
+        <w:br/>
+        <w:t>Adamus Salamon, manual labourer at the iron mill, from Moravia, married, about 29 years old. Has resided here for 2 years. Has one son.</w:t>
+        <w:br/>
+        <w:t>Lazarus Michl, a trader wandering here and there to the villages. From the Market Town of Oroszvár in Moson County. About :36 [OCR; probably 36] years old, married, has 3 sons, 2 daughters. Has resided for a year and a half.</w:t>
+      </w:r>
+    </w:p>
+    <w:p>
+      <w:r>
+        <w:t>IN THE ESTATE OF ALMÁS</w:t>
+      </w:r>
+    </w:p>
+    <w:p>
+      <w:r>
+        <w:t>Jacobus Kapl. Overseer of Salamon Taics in the iron mill, from Moravia, about 26 years old. Has resided here for a year and a half, married, has no children.</w:t>
+      </w:r>
+    </w:p>
+    <w:p>
+      <w:r>
+        <w:t>IN THE ESTATE OF KÚCS [OCR reading]</w:t>
+      </w:r>
+    </w:p>
+    <w:p>
+      <w:r>
+        <w:t>Simon Neustadl. A petty trader, wanders through the villages.</w:t>
+        <w:br/>
+        <w:t>Concerning which census of the above-written Jews, made by us in the foregoing manner, we have thought fit to issue these letters of testimony, fortified with our own signatures and the impressions of our customary seals. Komárom, year and day as above.</w:t>
+        <w:br/>
+        <w:t>Franciscus Somody, Judge of the nobles [Judlium] of the Illustrious County of Komárom L. S.</w:t>
+        <w:br/>
+        <w:t>Adamus H II ina 1 [OCR; name garbled], Assessor of the Judicial Table of the same Illustrious County L. S.</w:t>
+      </w:r>
+    </w:p>
+    <w:p>
+      <w:r>
+        <w:t>In the year 1726 [sic in OCR; the document is dated 1725], on the 8th &amp; O. [OCR; probably 9th] days of the month of August, upon the gracious dispatch of the Illustrious County of Komárom, in conformity with the benign intimation of the Exalted Royal Lieutenancy Council, a census of the Jews was made in the District of Újvár [Processu Uyvariensi] by us, the undersigned, in the following manner and order, and first of all:</w:t>
+      </w:r>
+    </w:p>
+    <w:p>
+      <w:r>
+        <w:t>IN THE ESTATE OF CSUZ [OCR: CSU Z]</w:t>
+      </w:r>
+    </w:p>
+    <w:p>
+      <w:r>
+        <w:t>Protection                                | Jews</w:t>
+        <w:br/>
+        <w:t>------------------------------------------|------------------------------------------</w:t>
+        <w:br/>
+        <w:t>Under the protection of the Spectable     | The Jew Ersl Aáron, lessee of the</w:t>
+        <w:br/>
+        <w:t xml:space="preserve">  Lord Baron Franciscus Szluha            |   brewery, distillery and VIru [OCR;</w:t>
+        <w:br/>
+        <w:t xml:space="preserve">                                          |   reading uncertain], otherwise a subject</w:t>
+        <w:br/>
+        <w:t xml:space="preserve">                                          |   of His Most Excellent Lord Count</w:t>
+        <w:br/>
+        <w:t xml:space="preserve">                                          |   Nicolaus Pálffy, Palatine of the</w:t>
+        <w:br/>
+        <w:t xml:space="preserve">                                          |   Kingdom of Hungary.</w:t>
+        <w:br/>
+        <w:t>Under the same Titled Lord Baron.         | Jacobus Lebl with son, lessee of the</w:t>
+        <w:br/>
+        <w:t xml:space="preserve">                                          |   butcher's shop, subject of His Most</w:t>
+        <w:br/>
+        <w:t xml:space="preserve">                                          |   Excellent Lord Marcus Czobor.</w:t>
+        <w:br/>
+        <w:t>Under the protection of the Titled Lord   | Simon Anzill. Subject of His Most</w:t>
+        <w:br/>
+        <w:t xml:space="preserve">  Geor. Fekete.                           |   Excellent Lord Count von Kaunitz,</w:t>
+        <w:br/>
+        <w:t xml:space="preserve">                                          |   formerly lessee of the brewery of Lord</w:t>
+        <w:br/>
+        <w:t xml:space="preserve">                                          |   Jacobus Oxi, but now, having no</w:t>
+        <w:br/>
+        <w:t xml:space="preserve">                                          |   benefice, lives on his own money.</w:t>
+        <w:br/>
+        <w:t>In the same place, under the same         | Isaac Lebl. Carrying on trade in various</w:t>
+        <w:br/>
+        <w:t xml:space="preserve">  protection.                             |   goods throughout the Kingdom. Subject</w:t>
+        <w:br/>
+        <w:t xml:space="preserve">                                          |   of His Most Excellent Lord Count von</w:t>
+        <w:br/>
+        <w:t xml:space="preserve">                                          |   Kaunitz.</w:t>
+        <w:br/>
+        <w:t>In the same place, under the same         | Jacobus Lebl. Occasionally carries on</w:t>
+        <w:br/>
+        <w:t xml:space="preserve">  protection.                             |   trade.</w:t>
+        <w:br/>
+        <w:t xml:space="preserve">                                          | Marcus Kloin [OCR; probably Klein]</w:t>
+        <w:br/>
+        <w:t xml:space="preserve">                                          |   carries on trade in various goods,</w:t>
+        <w:br/>
+        <w:t xml:space="preserve">                                          |   subject of His Most Excellent Lord</w:t>
+        <w:br/>
+        <w:t xml:space="preserve">                                          |   Count von Kaunitz.</w:t>
+        <w:br/>
+        <w:t>In the same place                         | Bernardus Dopich. Carries on trade in</w:t>
+        <w:br/>
+        <w:t xml:space="preserve">                                          |   merchandise, subject of His Most</w:t>
+        <w:br/>
+        <w:t xml:space="preserve">                                          |   Excellent Lord Count von Kaunitz.</w:t>
+        <w:br/>
+        <w:t>In the same place                         | Israel Jakab. Carries on trade in</w:t>
+        <w:br/>
+        <w:t xml:space="preserve">                                          |   merchandise, subject of His Most</w:t>
+        <w:br/>
+        <w:t xml:space="preserve">                                          |   Excellent Lord Count Marcus Czobor.</w:t>
+      </w:r>
+    </w:p>
+    <w:p>
+      <w:r>
+        <w:t>85</w:t>
+      </w:r>
+    </w:p>
+    <w:p>
+      <w:pPr>
+        <w:pStyle w:val="Heading1"/>
+      </w:pPr>
+      <w:r>
+        <w:t>PDF viewer page 88</w:t>
+      </w:r>
+    </w:p>
+    <w:p>
+      <w:r>
+        <w:t>https://real-eod.mtak.hu/2973/1/Magyar_zsido_okleveltar_VII.pdf#page=88</w:t>
+      </w:r>
+    </w:p>
+    <w:p>
+      <w:r>
+        <w:t>Protection                                | Jews</w:t>
+        <w:br/>
+        <w:t>------------------------------------------|------------------------------------------</w:t>
+        <w:br/>
+        <w:t>In the same place                         | David Lebl with son, lessee of the</w:t>
+        <w:br/>
+        <w:t xml:space="preserve">                                          |   distillery, [subject] of His Most</w:t>
+        <w:br/>
+        <w:t xml:space="preserve">                                          |   Excellent Lord Count von Kaunitz.</w:t>
+        <w:br/>
+        <w:t>In the same place                         | Joannes Anzill. Carries on mercantile</w:t>
+        <w:br/>
+        <w:t xml:space="preserve">                                          |   trade, subject of His Most Excellent</w:t>
+        <w:br/>
+        <w:t xml:space="preserve">                                          |   Lord Count von Kaunitz.</w:t>
+        <w:br/>
+        <w:t>In the same place                         | Jacobus Aáron. Occasionally carries on</w:t>
+        <w:br/>
+        <w:t xml:space="preserve">                                          |   mercantile trade, subject of the Most</w:t>
+        <w:br/>
+        <w:t xml:space="preserve">                                          |   Excellent and Most Illustrious Count</w:t>
+        <w:br/>
+        <w:t xml:space="preserve">                                          |   von Kaunitz.</w:t>
+        <w:br/>
+        <w:t>In the same place                         | Salamon Klein. Carries on mercantile</w:t>
+        <w:br/>
+        <w:t xml:space="preserve">                                          |   trade, subject of His Most Excellent</w:t>
+        <w:br/>
+        <w:t xml:space="preserve">                                          |   Lord Count von Kaunitz.</w:t>
+        <w:br/>
+        <w:t>In the same place                         | Abraham Sartor, occasionally [practises]</w:t>
+        <w:br/>
+        <w:t xml:space="preserve">                                          |   a craft, sometimes carries on trade.</w:t>
+        <w:br/>
+        <w:t>In the same place                         | Hirsl Szklenár occasionally carries on</w:t>
+        <w:br/>
+        <w:t xml:space="preserve">                                          |   trade, subject of His Most Excellent</w:t>
+        <w:br/>
+        <w:t xml:space="preserve">                                          |   Lord Count von Kaunitz.</w:t>
+        <w:br/>
+        <w:t>In the same place                         | Isaac Prusnics occasionally carries on</w:t>
+        <w:br/>
+        <w:t xml:space="preserve">                                          |   mercantile trade, subject of the Prince</w:t>
+        <w:br/>
+        <w:t xml:space="preserve">                                          |   von Liechtenstein.</w:t>
+        <w:br/>
+        <w:t>In the same place                         | The Jew Volff. Occasionally carries on</w:t>
+        <w:br/>
+        <w:t xml:space="preserve">                                          |   trade in produce, subject of His Most</w:t>
+        <w:br/>
+        <w:t xml:space="preserve">                                          |   Excellent Lord Count Kaunitz.</w:t>
+        <w:br/>
+        <w:t>In the same Estate. Under the protection  | Simon Prusztics. Carries on mercantile</w:t>
+        <w:br/>
+        <w:t xml:space="preserve">  of the Most Illustrious Lord Michael    |   trade, subject of the Prince von</w:t>
+        <w:br/>
+        <w:t xml:space="preserve">  Naszvady.                               |   Liechtenstein.</w:t>
+        <w:br/>
+        <w:t xml:space="preserve">                                          | Michael, a Jew, carries on trade,</w:t>
+        <w:br/>
+        <w:t xml:space="preserve">                                          |   subject of the Prince von Dietrichstein.</w:t>
+        <w:br/>
+        <w:t>In the same Estate, under Lord Adam       | Samuel Elias with Elias Lebl. Lessees of</w:t>
+        <w:br/>
+        <w:t xml:space="preserve">  Rötth.                                  |   the brewery and distillery, subjects of</w:t>
+        <w:br/>
+        <w:t xml:space="preserve">                                          |   His Most Excellent Lord Count von</w:t>
+        <w:br/>
+        <w:t xml:space="preserve">                                          |   Kaunitz.</w:t>
+        <w:br/>
+        <w:t>In the same estate, Szömöre, under the    | Salamon Peho, furrier [pelio], subject</w:t>
+        <w:br/>
+        <w:t xml:space="preserve">  protection of Lord Oxl.                 |   of His Most Excellent Lord Count von</w:t>
+        <w:br/>
+        <w:t xml:space="preserve">                                          |   Kaunitz.</w:t>
+        <w:br/>
+        <w:t>In the Estate of Csehy, under the         | The Jew Eszerias. Lessee of the</w:t>
+        <w:br/>
+        <w:t xml:space="preserve">  protection of Lord Steph. Baranyai      |   distillery, subject of His Most</w:t>
+        <w:br/>
+        <w:t xml:space="preserve">                                          |   Excellent Lord Count von Kaunitz.</w:t>
+        <w:br/>
+        <w:t>In the Estate of Fül' [OCR; reading       | The Jew Isaac, lessee of the distillery,</w:t>
+        <w:br/>
+        <w:t xml:space="preserve">  uncertain], under the protection of     |   subject of the Prince von Liechtenstein.</w:t>
+        <w:br/>
+        <w:t xml:space="preserve">  Lord Lad. Luby.                         |</w:t>
+      </w:r>
+    </w:p>
+    <w:p>
+      <w:r>
+        <w:t>Concerning which census of the above-written Jews, made by us in the foregoing manner, we have thought fit to issue these letters of testimony, fortified with our own signatures and the impressions of our customary seals. Given at Komárom, year and day as above.</w:t>
+      </w:r>
+    </w:p>
+    <w:p>
+      <w:r>
+        <w:t>Andreas Rőtth, District Judge of the nobles [processualis ord. Judlium] of the Illustrious County of Komárom L. S.</w:t>
+        <w:br/>
+        <w:t>Emericus Surány, Sworn Assessor of the same Illustrious County L. S.</w:t>
+      </w:r>
+    </w:p>
+    <w:p>
+      <w:r>
+        <w:t>Apart from the Hebrews listed above in the foregoing manner, no others are found in this County of Komárom.</w:t>
+      </w:r>
+    </w:p>
+    <w:p>
+      <w:r>
+        <w:t>Issued by Leopoldus Piroldt, sworn vice-notary of the aforesaid County of Komárom. L. S.</w:t>
+      </w:r>
+    </w:p>
+    <w:p>
+      <w:r>
+        <w:t>Catalogue of the Jews of Komárom County, submitted 15 Aug. 1725.</w:t>
+      </w:r>
+    </w:p>
+    <w:p>
+      <w:r>
+        <w:t>O. L. Htt. Fasc. Msnsíum Litt. Act. part. ~ o 269. [archive reference partly garbled in OCR]</w:t>
+      </w:r>
+    </w:p>
+    <w:p>
+      <w:r>
+        <w:t>86</w:t>
       </w:r>
     </w:p>
     <w:sectPr>

</xml_diff>